<commit_message>
docs: team members on the documentation cover and in the README
Co-Authored-By: Claude Opus 5.5 <noreply@anthropic.com>
Claude-Session: https://claude.ai/code/session_01NZHPyp1BcAyBymo1vC6nPu
</commit_message>
<xml_diff>
--- a/docs/PROJECT_DOCUMENTATION.docx
+++ b/docs/PROJECT_DOCUMENTATION.docx
@@ -274,7 +274,14 @@
             <w:pPr>
               <w:pStyle w:val="Compact"/>
               <w:spacing w:after="40"/>
-            </w:pPr>
+              <w:jc w:val="left"/>
+            </w:pPr>
+            <w:r>
+              <w:rPr>
+                <w:sz w:val="19"/>
+              </w:rPr>
+              <w:t xml:space="preserve">Loum Vanchha</w:t>
+            </w:r>
           </w:p>
         </w:tc>
         <w:tc>
@@ -319,7 +326,14 @@
             <w:pPr>
               <w:pStyle w:val="Compact"/>
               <w:spacing w:after="40"/>
-            </w:pPr>
+              <w:jc w:val="left"/>
+            </w:pPr>
+            <w:r>
+              <w:rPr>
+                <w:sz w:val="19"/>
+              </w:rPr>
+              <w:t xml:space="preserve">Hong Dalin</w:t>
+            </w:r>
           </w:p>
         </w:tc>
         <w:tc>
@@ -364,7 +378,14 @@
             <w:pPr>
               <w:pStyle w:val="Compact"/>
               <w:spacing w:after="40"/>
-            </w:pPr>
+              <w:jc w:val="left"/>
+            </w:pPr>
+            <w:r>
+              <w:rPr>
+                <w:sz w:val="19"/>
+              </w:rPr>
+              <w:t xml:space="preserve">Khounn Eangleng</w:t>
+            </w:r>
           </w:p>
         </w:tc>
         <w:tc>
@@ -409,7 +430,66 @@
             <w:pPr>
               <w:pStyle w:val="Compact"/>
               <w:spacing w:after="40"/>
-            </w:pPr>
+              <w:jc w:val="left"/>
+            </w:pPr>
+            <w:r>
+              <w:rPr>
+                <w:sz w:val="19"/>
+              </w:rPr>
+              <w:t xml:space="preserve">Sour Sombo</w:t>
+            </w:r>
+          </w:p>
+        </w:tc>
+        <w:tc>
+          <w:tcPr/>
+          <w:p>
+            <w:pPr>
+              <w:pStyle w:val="Compact"/>
+              <w:spacing w:after="40"/>
+            </w:pPr>
+          </w:p>
+        </w:tc>
+        <w:tc>
+          <w:tcPr/>
+          <w:p>
+            <w:pPr>
+              <w:pStyle w:val="Compact"/>
+              <w:spacing w:after="40"/>
+            </w:pPr>
+          </w:p>
+        </w:tc>
+      </w:tr>
+      <w:tr>
+        <w:tc>
+          <w:tcPr/>
+          <w:p>
+            <w:pPr>
+              <w:pStyle w:val="Compact"/>
+              <w:spacing w:after="40"/>
+              <w:jc w:val="left"/>
+            </w:pPr>
+            <w:r>
+              <w:rPr>
+                <w:sz w:val="19"/>
+              </w:rPr>
+              <w:t xml:space="preserve">5</w:t>
+            </w:r>
+          </w:p>
+        </w:tc>
+        <w:tc>
+          <w:tcPr/>
+          <w:p>
+            <w:pPr>
+              <w:pStyle w:val="Compact"/>
+              <w:spacing w:after="40"/>
+              <w:jc w:val="left"/>
+            </w:pPr>
+            <w:r>
+              <w:rPr>
+                <w:sz w:val="19"/>
+              </w:rPr>
+              <w:t xml:space="preserve">Rem Sophannary</w:t>
+            </w:r>
           </w:p>
         </w:tc>
         <w:tc>

</xml_diff>

<commit_message>
docs: team members on the documentation cover and in the README Claude-Session: https://claude.ai/code/session_01NZHPyp1BcAyBymo1vC6nPu
</commit_message>
<xml_diff>
--- a/docs/PROJECT_DOCUMENTATION.docx
+++ b/docs/PROJECT_DOCUMENTATION.docx
@@ -274,7 +274,14 @@
             <w:pPr>
               <w:pStyle w:val="Compact"/>
               <w:spacing w:after="40"/>
-            </w:pPr>
+              <w:jc w:val="left"/>
+            </w:pPr>
+            <w:r>
+              <w:rPr>
+                <w:sz w:val="19"/>
+              </w:rPr>
+              <w:t xml:space="preserve">Loum Vanchha</w:t>
+            </w:r>
           </w:p>
         </w:tc>
         <w:tc>
@@ -319,7 +326,14 @@
             <w:pPr>
               <w:pStyle w:val="Compact"/>
               <w:spacing w:after="40"/>
-            </w:pPr>
+              <w:jc w:val="left"/>
+            </w:pPr>
+            <w:r>
+              <w:rPr>
+                <w:sz w:val="19"/>
+              </w:rPr>
+              <w:t xml:space="preserve">Hong Dalin</w:t>
+            </w:r>
           </w:p>
         </w:tc>
         <w:tc>
@@ -364,7 +378,14 @@
             <w:pPr>
               <w:pStyle w:val="Compact"/>
               <w:spacing w:after="40"/>
-            </w:pPr>
+              <w:jc w:val="left"/>
+            </w:pPr>
+            <w:r>
+              <w:rPr>
+                <w:sz w:val="19"/>
+              </w:rPr>
+              <w:t xml:space="preserve">Khounn Eangleng</w:t>
+            </w:r>
           </w:p>
         </w:tc>
         <w:tc>
@@ -409,7 +430,66 @@
             <w:pPr>
               <w:pStyle w:val="Compact"/>
               <w:spacing w:after="40"/>
-            </w:pPr>
+              <w:jc w:val="left"/>
+            </w:pPr>
+            <w:r>
+              <w:rPr>
+                <w:sz w:val="19"/>
+              </w:rPr>
+              <w:t xml:space="preserve">Sour Sombo</w:t>
+            </w:r>
+          </w:p>
+        </w:tc>
+        <w:tc>
+          <w:tcPr/>
+          <w:p>
+            <w:pPr>
+              <w:pStyle w:val="Compact"/>
+              <w:spacing w:after="40"/>
+            </w:pPr>
+          </w:p>
+        </w:tc>
+        <w:tc>
+          <w:tcPr/>
+          <w:p>
+            <w:pPr>
+              <w:pStyle w:val="Compact"/>
+              <w:spacing w:after="40"/>
+            </w:pPr>
+          </w:p>
+        </w:tc>
+      </w:tr>
+      <w:tr>
+        <w:tc>
+          <w:tcPr/>
+          <w:p>
+            <w:pPr>
+              <w:pStyle w:val="Compact"/>
+              <w:spacing w:after="40"/>
+              <w:jc w:val="left"/>
+            </w:pPr>
+            <w:r>
+              <w:rPr>
+                <w:sz w:val="19"/>
+              </w:rPr>
+              <w:t xml:space="preserve">5</w:t>
+            </w:r>
+          </w:p>
+        </w:tc>
+        <w:tc>
+          <w:tcPr/>
+          <w:p>
+            <w:pPr>
+              <w:pStyle w:val="Compact"/>
+              <w:spacing w:after="40"/>
+              <w:jc w:val="left"/>
+            </w:pPr>
+            <w:r>
+              <w:rPr>
+                <w:sz w:val="19"/>
+              </w:rPr>
+              <w:t xml:space="preserve">Rem Sophannary</w:t>
+            </w:r>
           </w:p>
         </w:tc>
         <w:tc>

</xml_diff>

<commit_message>
docs: cover lists team names only (no student ID or role)
Co-Authored-By: Claude Opus 5.5 <noreply@anthropic.com>
Claude-Session: https://claude.ai/code/session_01NZHPyp1BcAyBymo1vC6nPu
</commit_message>
<xml_diff>
--- a/docs/PROJECT_DOCUMENTATION.docx
+++ b/docs/PROJECT_DOCUMENTATION.docx
@@ -165,10 +165,8 @@
         </w:tblBorders>
       </w:tblPr>
       <w:tblGrid>
-        <w:gridCol w:w="1980"/>
-        <w:gridCol w:w="1980"/>
-        <w:gridCol w:w="1980"/>
-        <w:gridCol w:w="1980"/>
+        <w:gridCol w:w="3960"/>
+        <w:gridCol w:w="3960"/>
       </w:tblGrid>
       <w:tr>
         <w:trPr>
@@ -212,44 +210,6 @@
             </w:r>
           </w:p>
         </w:tc>
-        <w:tc>
-          <w:tcPr>
-            <w:shd w:val="clear" w:fill="E0F2FE"/>
-          </w:tcPr>
-          <w:p>
-            <w:pPr>
-              <w:pStyle w:val="Compact"/>
-              <w:spacing w:after="40"/>
-              <w:jc w:val="left"/>
-            </w:pPr>
-            <w:r>
-              <w:rPr>
-                <w:b/>
-                <w:sz w:val="19"/>
-              </w:rPr>
-              <w:t xml:space="preserve">Student ID</w:t>
-            </w:r>
-          </w:p>
-        </w:tc>
-        <w:tc>
-          <w:tcPr>
-            <w:shd w:val="clear" w:fill="E0F2FE"/>
-          </w:tcPr>
-          <w:p>
-            <w:pPr>
-              <w:pStyle w:val="Compact"/>
-              <w:spacing w:after="40"/>
-              <w:jc w:val="left"/>
-            </w:pPr>
-            <w:r>
-              <w:rPr>
-                <w:b/>
-                <w:sz w:val="19"/>
-              </w:rPr>
-              <w:t xml:space="preserve">Role</w:t>
-            </w:r>
-          </w:p>
-        </w:tc>
       </w:tr>
       <w:tr>
         <w:tc>
@@ -284,24 +244,6 @@
             </w:r>
           </w:p>
         </w:tc>
-        <w:tc>
-          <w:tcPr/>
-          <w:p>
-            <w:pPr>
-              <w:pStyle w:val="Compact"/>
-              <w:spacing w:after="40"/>
-            </w:pPr>
-          </w:p>
-        </w:tc>
-        <w:tc>
-          <w:tcPr/>
-          <w:p>
-            <w:pPr>
-              <w:pStyle w:val="Compact"/>
-              <w:spacing w:after="40"/>
-            </w:pPr>
-          </w:p>
-        </w:tc>
       </w:tr>
       <w:tr>
         <w:tc>
@@ -336,24 +278,6 @@
             </w:r>
           </w:p>
         </w:tc>
-        <w:tc>
-          <w:tcPr/>
-          <w:p>
-            <w:pPr>
-              <w:pStyle w:val="Compact"/>
-              <w:spacing w:after="40"/>
-            </w:pPr>
-          </w:p>
-        </w:tc>
-        <w:tc>
-          <w:tcPr/>
-          <w:p>
-            <w:pPr>
-              <w:pStyle w:val="Compact"/>
-              <w:spacing w:after="40"/>
-            </w:pPr>
-          </w:p>
-        </w:tc>
       </w:tr>
       <w:tr>
         <w:tc>
@@ -388,24 +312,6 @@
             </w:r>
           </w:p>
         </w:tc>
-        <w:tc>
-          <w:tcPr/>
-          <w:p>
-            <w:pPr>
-              <w:pStyle w:val="Compact"/>
-              <w:spacing w:after="40"/>
-            </w:pPr>
-          </w:p>
-        </w:tc>
-        <w:tc>
-          <w:tcPr/>
-          <w:p>
-            <w:pPr>
-              <w:pStyle w:val="Compact"/>
-              <w:spacing w:after="40"/>
-            </w:pPr>
-          </w:p>
-        </w:tc>
       </w:tr>
       <w:tr>
         <w:tc>
@@ -440,24 +346,6 @@
             </w:r>
           </w:p>
         </w:tc>
-        <w:tc>
-          <w:tcPr/>
-          <w:p>
-            <w:pPr>
-              <w:pStyle w:val="Compact"/>
-              <w:spacing w:after="40"/>
-            </w:pPr>
-          </w:p>
-        </w:tc>
-        <w:tc>
-          <w:tcPr/>
-          <w:p>
-            <w:pPr>
-              <w:pStyle w:val="Compact"/>
-              <w:spacing w:after="40"/>
-            </w:pPr>
-          </w:p>
-        </w:tc>
       </w:tr>
       <w:tr>
         <w:tc>
@@ -490,24 +378,6 @@
               </w:rPr>
               <w:t xml:space="preserve">Rem Sophannary</w:t>
             </w:r>
-          </w:p>
-        </w:tc>
-        <w:tc>
-          <w:tcPr/>
-          <w:p>
-            <w:pPr>
-              <w:pStyle w:val="Compact"/>
-              <w:spacing w:after="40"/>
-            </w:pPr>
-          </w:p>
-        </w:tc>
-        <w:tc>
-          <w:tcPr/>
-          <w:p>
-            <w:pPr>
-              <w:pStyle w:val="Compact"/>
-              <w:spacing w:after="40"/>
-            </w:pPr>
           </w:p>
         </w:tc>
       </w:tr>

</xml_diff>

<commit_message>
docs: cover lists team names only (no student ID or role) Claude-Session: https://claude.ai/code/session_01NZHPyp1BcAyBymo1vC6nPu
</commit_message>
<xml_diff>
--- a/docs/PROJECT_DOCUMENTATION.docx
+++ b/docs/PROJECT_DOCUMENTATION.docx
@@ -165,10 +165,8 @@
         </w:tblBorders>
       </w:tblPr>
       <w:tblGrid>
-        <w:gridCol w:w="1980"/>
-        <w:gridCol w:w="1980"/>
-        <w:gridCol w:w="1980"/>
-        <w:gridCol w:w="1980"/>
+        <w:gridCol w:w="3960"/>
+        <w:gridCol w:w="3960"/>
       </w:tblGrid>
       <w:tr>
         <w:trPr>
@@ -212,44 +210,6 @@
             </w:r>
           </w:p>
         </w:tc>
-        <w:tc>
-          <w:tcPr>
-            <w:shd w:val="clear" w:fill="E0F2FE"/>
-          </w:tcPr>
-          <w:p>
-            <w:pPr>
-              <w:pStyle w:val="Compact"/>
-              <w:spacing w:after="40"/>
-              <w:jc w:val="left"/>
-            </w:pPr>
-            <w:r>
-              <w:rPr>
-                <w:b/>
-                <w:sz w:val="19"/>
-              </w:rPr>
-              <w:t xml:space="preserve">Student ID</w:t>
-            </w:r>
-          </w:p>
-        </w:tc>
-        <w:tc>
-          <w:tcPr>
-            <w:shd w:val="clear" w:fill="E0F2FE"/>
-          </w:tcPr>
-          <w:p>
-            <w:pPr>
-              <w:pStyle w:val="Compact"/>
-              <w:spacing w:after="40"/>
-              <w:jc w:val="left"/>
-            </w:pPr>
-            <w:r>
-              <w:rPr>
-                <w:b/>
-                <w:sz w:val="19"/>
-              </w:rPr>
-              <w:t xml:space="preserve">Role</w:t>
-            </w:r>
-          </w:p>
-        </w:tc>
       </w:tr>
       <w:tr>
         <w:tc>
@@ -284,24 +244,6 @@
             </w:r>
           </w:p>
         </w:tc>
-        <w:tc>
-          <w:tcPr/>
-          <w:p>
-            <w:pPr>
-              <w:pStyle w:val="Compact"/>
-              <w:spacing w:after="40"/>
-            </w:pPr>
-          </w:p>
-        </w:tc>
-        <w:tc>
-          <w:tcPr/>
-          <w:p>
-            <w:pPr>
-              <w:pStyle w:val="Compact"/>
-              <w:spacing w:after="40"/>
-            </w:pPr>
-          </w:p>
-        </w:tc>
       </w:tr>
       <w:tr>
         <w:tc>
@@ -336,24 +278,6 @@
             </w:r>
           </w:p>
         </w:tc>
-        <w:tc>
-          <w:tcPr/>
-          <w:p>
-            <w:pPr>
-              <w:pStyle w:val="Compact"/>
-              <w:spacing w:after="40"/>
-            </w:pPr>
-          </w:p>
-        </w:tc>
-        <w:tc>
-          <w:tcPr/>
-          <w:p>
-            <w:pPr>
-              <w:pStyle w:val="Compact"/>
-              <w:spacing w:after="40"/>
-            </w:pPr>
-          </w:p>
-        </w:tc>
       </w:tr>
       <w:tr>
         <w:tc>
@@ -388,24 +312,6 @@
             </w:r>
           </w:p>
         </w:tc>
-        <w:tc>
-          <w:tcPr/>
-          <w:p>
-            <w:pPr>
-              <w:pStyle w:val="Compact"/>
-              <w:spacing w:after="40"/>
-            </w:pPr>
-          </w:p>
-        </w:tc>
-        <w:tc>
-          <w:tcPr/>
-          <w:p>
-            <w:pPr>
-              <w:pStyle w:val="Compact"/>
-              <w:spacing w:after="40"/>
-            </w:pPr>
-          </w:p>
-        </w:tc>
       </w:tr>
       <w:tr>
         <w:tc>
@@ -440,24 +346,6 @@
             </w:r>
           </w:p>
         </w:tc>
-        <w:tc>
-          <w:tcPr/>
-          <w:p>
-            <w:pPr>
-              <w:pStyle w:val="Compact"/>
-              <w:spacing w:after="40"/>
-            </w:pPr>
-          </w:p>
-        </w:tc>
-        <w:tc>
-          <w:tcPr/>
-          <w:p>
-            <w:pPr>
-              <w:pStyle w:val="Compact"/>
-              <w:spacing w:after="40"/>
-            </w:pPr>
-          </w:p>
-        </w:tc>
       </w:tr>
       <w:tr>
         <w:tc>
@@ -490,24 +378,6 @@
               </w:rPr>
               <w:t xml:space="preserve">Rem Sophannary</w:t>
             </w:r>
-          </w:p>
-        </w:tc>
-        <w:tc>
-          <w:tcPr/>
-          <w:p>
-            <w:pPr>
-              <w:pStyle w:val="Compact"/>
-              <w:spacing w:after="40"/>
-            </w:pPr>
-          </w:p>
-        </w:tc>
-        <w:tc>
-          <w:tcPr/>
-          <w:p>
-            <w:pPr>
-              <w:pStyle w:val="Compact"/>
-              <w:spacing w:after="40"/>
-            </w:pPr>
           </w:p>
         </w:tc>
       </w:tr>

</xml_diff>

<commit_message>
docs: lecturer before the team members on the cover
Co-Authored-By: Claude Opus 5.5 <noreply@anthropic.com>
Claude-Session: https://claude.ai/code/session_01NZHPyp1BcAyBymo1vC6nPu
</commit_message>
<xml_diff>
--- a/docs/PROJECT_DOCUMENTATION.docx
+++ b/docs/PROJECT_DOCUMENTATION.docx
@@ -136,6 +136,24 @@
           <w:t xml:space="preserve">https://github.com/Vanchha16/MA_Final</w:t>
         </w:r>
       </w:hyperlink>
+    </w:p>
+    <w:p>
+      <w:pPr>
+        <w:pStyle w:val="BodyText"/>
+      </w:pPr>
+      <w:r>
+        <w:rPr>
+          <w:bCs/>
+          <w:b/>
+        </w:rPr>
+        <w:t xml:space="preserve">Lecturer:</w:t>
+      </w:r>
+      <w:r>
+        <w:t xml:space="preserve"> </w:t>
+      </w:r>
+      <w:r>
+        <w:t xml:space="preserve">Ly Lay</w:t>
+      </w:r>
     </w:p>
     <w:p>
       <w:pPr>
@@ -382,24 +400,6 @@
         </w:tc>
       </w:tr>
     </w:tbl>
-    <w:p>
-      <w:pPr>
-        <w:pStyle w:val="BodyText"/>
-      </w:pPr>
-      <w:r>
-        <w:rPr>
-          <w:bCs/>
-          <w:b/>
-        </w:rPr>
-        <w:t xml:space="preserve">Lecturer:</w:t>
-      </w:r>
-      <w:r>
-        <w:t xml:space="preserve"> </w:t>
-      </w:r>
-      <w:r>
-        <w:t xml:space="preserve">Ly Lay</w:t>
-      </w:r>
-    </w:p>
     <w:p>
       <w:r>
         <w:br w:type="page"/>

</xml_diff>

<commit_message>
docs: lecturer before the team members on the cover Claude-Session: https://claude.ai/code/session_01NZHPyp1BcAyBymo1vC6nPu
</commit_message>
<xml_diff>
--- a/docs/PROJECT_DOCUMENTATION.docx
+++ b/docs/PROJECT_DOCUMENTATION.docx
@@ -136,6 +136,24 @@
           <w:t xml:space="preserve">https://github.com/Vanchha16/MA_Final</w:t>
         </w:r>
       </w:hyperlink>
+    </w:p>
+    <w:p>
+      <w:pPr>
+        <w:pStyle w:val="BodyText"/>
+      </w:pPr>
+      <w:r>
+        <w:rPr>
+          <w:bCs/>
+          <w:b/>
+        </w:rPr>
+        <w:t xml:space="preserve">Lecturer:</w:t>
+      </w:r>
+      <w:r>
+        <w:t xml:space="preserve"> </w:t>
+      </w:r>
+      <w:r>
+        <w:t xml:space="preserve">Ly Lay</w:t>
+      </w:r>
     </w:p>
     <w:p>
       <w:pPr>
@@ -382,24 +400,6 @@
         </w:tc>
       </w:tr>
     </w:tbl>
-    <w:p>
-      <w:pPr>
-        <w:pStyle w:val="BodyText"/>
-      </w:pPr>
-      <w:r>
-        <w:rPr>
-          <w:bCs/>
-          <w:b/>
-        </w:rPr>
-        <w:t xml:space="preserve">Lecturer:</w:t>
-      </w:r>
-      <w:r>
-        <w:t xml:space="preserve"> </w:t>
-      </w:r>
-      <w:r>
-        <w:t xml:space="preserve">Ly Lay</w:t>
-      </w:r>
-    </w:p>
     <w:p>
       <w:r>
         <w:br w:type="page"/>

</xml_diff>

<commit_message>
docs: SETEC Institute logo on the documentation cover
Logo from the institute's website (setecu.com).

Co-Authored-By: Claude Opus 5.5 <noreply@anthropic.com>
Claude-Session: https://claude.ai/code/session_01NZHPyp1BcAyBymo1vC6nPu
</commit_message>
<xml_diff>
--- a/docs/PROJECT_DOCUMENTATION.docx
+++ b/docs/PROJECT_DOCUMENTATION.docx
@@ -4,22 +4,62 @@
   <w:body>
     <w:p>
       <w:pPr>
+        <w:pStyle w:val="FirstParagraph"/>
+        <w:spacing w:after="360"/>
+        <w:jc w:val="center"/>
+      </w:pPr>
+      <w:r>
+        <w:drawing>
+          <wp:inline>
+            <wp:extent cx="3291840" cy="804672"/>
+            <wp:effectExtent b="0" l="0" r="0" t="0"/>
+            <wp:docPr descr="SETEC Institute" title="" id="21" name="Picture"/>
+            <a:graphic>
+              <a:graphicData uri="http://schemas.openxmlformats.org/drawingml/2006/picture">
+                <pic:pic>
+                  <pic:nvPicPr>
+                    <pic:cNvPr descr="images/setec-logo.png" id="22" name="Picture"/>
+                    <pic:cNvPicPr>
+                      <a:picLocks noChangeArrowheads="1" noChangeAspect="1"/>
+                    </pic:cNvPicPr>
+                  </pic:nvPicPr>
+                  <pic:blipFill>
+                    <a:blip r:embed="rId20"/>
+                    <a:stretch>
+                      <a:fillRect/>
+                    </a:stretch>
+                  </pic:blipFill>
+                  <pic:spPr bwMode="auto">
+                    <a:xfrm>
+                      <a:off x="0" y="0"/>
+                      <a:ext cx="3291840" cy="804672"/>
+                    </a:xfrm>
+                    <a:prstGeom prst="rect">
+                      <a:avLst/>
+                    </a:prstGeom>
+                    <a:noFill/>
+                    <a:ln w="9525">
+                      <a:noFill/>
+                      <a:headEnd/>
+                      <a:tailEnd/>
+                    </a:ln>
+                  </pic:spPr>
+                </pic:pic>
+              </a:graphicData>
+            </a:graphic>
+          </wp:inline>
+        </w:drawing>
+      </w:r>
+      <w:r>
+        <w:br/>
+      </w:r>
+    </w:p>
+    <w:p>
+      <w:pPr>
         <w:pStyle w:val="Title"/>
       </w:pPr>
       <w:r>
-        <w:t xml:space="preserve">Anime</w:t>
-      </w:r>
-      <w:r>
-        <w:t xml:space="preserve"> </w:t>
-      </w:r>
-      <w:r>
-        <w:t xml:space="preserve">World</w:t>
-      </w:r>
-      <w:r>
-        <w:t xml:space="preserve"> </w:t>
-      </w:r>
-      <w:r>
-        <w:t xml:space="preserve">Shop</w:t>
+        <w:t xml:space="preserve">Anime World Shop</w:t>
       </w:r>
     </w:p>
     <w:p>
@@ -27,48 +67,12 @@
         <w:pStyle w:val="Subtitle"/>
       </w:pPr>
       <w:r>
-        <w:t xml:space="preserve">E-Commerce</w:t>
-      </w:r>
-      <w:r>
-        <w:t xml:space="preserve"> </w:t>
-      </w:r>
-      <w:r>
-        <w:t xml:space="preserve">Mobile</w:t>
-      </w:r>
-      <w:r>
-        <w:t xml:space="preserve"> </w:t>
-      </w:r>
-      <w:r>
-        <w:t xml:space="preserve">Application</w:t>
-      </w:r>
-      <w:r>
-        <w:t xml:space="preserve"> </w:t>
-      </w:r>
-      <w:r>
-        <w:t xml:space="preserve">-</w:t>
-      </w:r>
-      <w:r>
-        <w:t xml:space="preserve"> </w:t>
-      </w:r>
-      <w:r>
-        <w:t xml:space="preserve">Complete</w:t>
-      </w:r>
-      <w:r>
-        <w:t xml:space="preserve"> </w:t>
-      </w:r>
-      <w:r>
-        <w:t xml:space="preserve">Project</w:t>
-      </w:r>
-      <w:r>
-        <w:t xml:space="preserve"> </w:t>
-      </w:r>
-      <w:r>
-        <w:t xml:space="preserve">Documentation</w:t>
-      </w:r>
-    </w:p>
-    <w:p>
-      <w:pPr>
-        <w:pStyle w:val="FirstParagraph"/>
+        <w:t xml:space="preserve">E-Commerce Mobile Application - Complete Project Documentation</w:t>
+      </w:r>
+    </w:p>
+    <w:p>
+      <w:pPr>
+        <w:pStyle w:val="BodyText"/>
       </w:pPr>
       <w:r>
         <w:rPr>
@@ -128,7 +132,7 @@
       <w:r>
         <w:t xml:space="preserve"> </w:t>
       </w:r>
-      <w:hyperlink r:id="rId20">
+      <w:hyperlink r:id="rId23">
         <w:r>
           <w:rPr>
             <w:rStyle w:val="Hyperlink"/>
@@ -19344,18 +19348,18 @@
           <wp:inline>
             <wp:extent cx="3447703" cy="7223760"/>
             <wp:effectExtent b="0" l="0" r="0" t="0"/>
-            <wp:docPr descr="Use case overview" title="" id="22" name="Picture"/>
+            <wp:docPr descr="Use case overview" title="" id="25" name="Picture"/>
             <a:graphic>
               <a:graphicData uri="http://schemas.openxmlformats.org/drawingml/2006/picture">
                 <pic:pic>
                   <pic:nvPicPr>
-                    <pic:cNvPr descr="diagrams/use-case-overview.png" id="23" name="Picture"/>
+                    <pic:cNvPr descr="diagrams/use-case-overview.png" id="26" name="Picture"/>
                     <pic:cNvPicPr>
                       <a:picLocks noChangeArrowheads="1" noChangeAspect="1"/>
                     </pic:cNvPicPr>
                   </pic:nvPicPr>
                   <pic:blipFill>
-                    <a:blip r:embed="rId21"/>
+                    <a:blip r:embed="rId24"/>
                     <a:stretch>
                       <a:fillRect/>
                     </a:stretch>
@@ -19440,18 +19444,18 @@
           <wp:inline>
             <wp:extent cx="4197102" cy="7223760"/>
             <wp:effectExtent b="0" l="0" r="0" t="0"/>
-            <wp:docPr descr="Customer use cases - browse, cart and wishlist" title="" id="25" name="Picture"/>
+            <wp:docPr descr="Customer use cases - browse, cart and wishlist" title="" id="28" name="Picture"/>
             <a:graphic>
               <a:graphicData uri="http://schemas.openxmlformats.org/drawingml/2006/picture">
                 <pic:pic>
                   <pic:nvPicPr>
-                    <pic:cNvPr descr="diagrams/use-case-customer-shopping.png" id="26" name="Picture"/>
+                    <pic:cNvPr descr="diagrams/use-case-customer-shopping.png" id="29" name="Picture"/>
                     <pic:cNvPicPr>
                       <a:picLocks noChangeArrowheads="1" noChangeAspect="1"/>
                     </pic:cNvPicPr>
                   </pic:nvPicPr>
                   <pic:blipFill>
-                    <a:blip r:embed="rId24"/>
+                    <a:blip r:embed="rId27"/>
                     <a:stretch>
                       <a:fillRect/>
                     </a:stretch>
@@ -19504,18 +19508,18 @@
           <wp:inline>
             <wp:extent cx="5213528" cy="7223760"/>
             <wp:effectExtent b="0" l="0" r="0" t="0"/>
-            <wp:docPr descr="Customer use cases - checkout and orders" title="" id="28" name="Picture"/>
+            <wp:docPr descr="Customer use cases - checkout and orders" title="" id="31" name="Picture"/>
             <a:graphic>
               <a:graphicData uri="http://schemas.openxmlformats.org/drawingml/2006/picture">
                 <pic:pic>
                   <pic:nvPicPr>
-                    <pic:cNvPr descr="diagrams/use-case-customer-orders.png" id="29" name="Picture"/>
+                    <pic:cNvPr descr="diagrams/use-case-customer-orders.png" id="32" name="Picture"/>
                     <pic:cNvPicPr>
                       <a:picLocks noChangeArrowheads="1" noChangeAspect="1"/>
                     </pic:cNvPicPr>
                   </pic:nvPicPr>
                   <pic:blipFill>
-                    <a:blip r:embed="rId27"/>
+                    <a:blip r:embed="rId30"/>
                     <a:stretch>
                       <a:fillRect/>
                     </a:stretch>
@@ -19568,18 +19572,18 @@
           <wp:inline>
             <wp:extent cx="5334000" cy="6127370"/>
             <wp:effectExtent b="0" l="0" r="0" t="0"/>
-            <wp:docPr descr="Customer use cases - account and support" title="" id="31" name="Picture"/>
+            <wp:docPr descr="Customer use cases - account and support" title="" id="34" name="Picture"/>
             <a:graphic>
               <a:graphicData uri="http://schemas.openxmlformats.org/drawingml/2006/picture">
                 <pic:pic>
                   <pic:nvPicPr>
-                    <pic:cNvPr descr="diagrams/use-case-customer-account.png" id="32" name="Picture"/>
+                    <pic:cNvPr descr="diagrams/use-case-customer-account.png" id="35" name="Picture"/>
                     <pic:cNvPicPr>
                       <a:picLocks noChangeArrowheads="1" noChangeAspect="1"/>
                     </pic:cNvPicPr>
                   </pic:nvPicPr>
                   <pic:blipFill>
-                    <a:blip r:embed="rId30"/>
+                    <a:blip r:embed="rId33"/>
                     <a:stretch>
                       <a:fillRect/>
                     </a:stretch>
@@ -19632,18 +19636,18 @@
           <wp:inline>
             <wp:extent cx="3473567" cy="7223760"/>
             <wp:effectExtent b="0" l="0" r="0" t="0"/>
-            <wp:docPr descr="Admin use cases" title="" id="34" name="Picture"/>
+            <wp:docPr descr="Admin use cases" title="" id="37" name="Picture"/>
             <a:graphic>
               <a:graphicData uri="http://schemas.openxmlformats.org/drawingml/2006/picture">
                 <pic:pic>
                   <pic:nvPicPr>
-                    <pic:cNvPr descr="diagrams/use-case-admin.png" id="35" name="Picture"/>
+                    <pic:cNvPr descr="diagrams/use-case-admin.png" id="38" name="Picture"/>
                     <pic:cNvPicPr>
                       <a:picLocks noChangeArrowheads="1" noChangeAspect="1"/>
                     </pic:cNvPicPr>
                   </pic:nvPicPr>
                   <pic:blipFill>
-                    <a:blip r:embed="rId33"/>
+                    <a:blip r:embed="rId36"/>
                     <a:stretch>
                       <a:fillRect/>
                     </a:stretch>
@@ -27264,18 +27268,18 @@
           <wp:inline>
             <wp:extent cx="5334000" cy="3498201"/>
             <wp:effectExtent b="0" l="0" r="0" t="0"/>
-            <wp:docPr descr="Overview ER diagram" title="" id="37" name="Picture"/>
+            <wp:docPr descr="Overview ER diagram" title="" id="40" name="Picture"/>
             <a:graphic>
               <a:graphicData uri="http://schemas.openxmlformats.org/drawingml/2006/picture">
                 <pic:pic>
                   <pic:nvPicPr>
-                    <pic:cNvPr descr="database/erd.png" id="38" name="Picture"/>
+                    <pic:cNvPr descr="database/erd.png" id="41" name="Picture"/>
                     <pic:cNvPicPr>
                       <a:picLocks noChangeArrowheads="1" noChangeAspect="1"/>
                     </pic:cNvPicPr>
                   </pic:nvPicPr>
                   <pic:blipFill>
-                    <a:blip r:embed="rId36"/>
+                    <a:blip r:embed="rId39"/>
                     <a:stretch>
                       <a:fillRect/>
                     </a:stretch>
@@ -27348,18 +27352,18 @@
           <wp:inline>
             <wp:extent cx="5334000" cy="3160317"/>
             <wp:effectExtent b="0" l="0" r="0" t="0"/>
-            <wp:docPr descr="Detailed ER diagram" title="" id="40" name="Picture"/>
+            <wp:docPr descr="Detailed ER diagram" title="" id="43" name="Picture"/>
             <a:graphic>
               <a:graphicData uri="http://schemas.openxmlformats.org/drawingml/2006/picture">
                 <pic:pic>
                   <pic:nvPicPr>
-                    <pic:cNvPr descr="database/erd-diagram.png" id="41" name="Picture"/>
+                    <pic:cNvPr descr="database/erd-diagram.png" id="44" name="Picture"/>
                     <pic:cNvPicPr>
                       <a:picLocks noChangeArrowheads="1" noChangeAspect="1"/>
                     </pic:cNvPicPr>
                   </pic:nvPicPr>
                   <pic:blipFill>
-                    <a:blip r:embed="rId39"/>
+                    <a:blip r:embed="rId42"/>
                     <a:stretch>
                       <a:fillRect/>
                     </a:stretch>
@@ -28841,7 +28845,7 @@
       <w:r>
         <w:t xml:space="preserve"> </w:t>
       </w:r>
-      <w:hyperlink r:id="rId42">
+      <w:hyperlink r:id="rId45">
         <w:r>
           <w:rPr>
             <w:rStyle w:val="Hyperlink"/>
@@ -48826,7 +48830,7 @@
       <w:r>
         <w:t xml:space="preserve"> </w:t>
       </w:r>
-      <w:hyperlink r:id="rId43">
+      <w:hyperlink r:id="rId46">
         <w:r>
           <w:rPr>
             <w:rStyle w:val="Hyperlink"/>

</xml_diff>

<commit_message>
feat(payment): remove the "I've paid - check now" button
The KHQR / ABA PayWay screen already checks the payment every 3 seconds, so
the receipt still prints by itself after paying. Only "Back to shop" remains,
shown when the QR has expired. Use case UC-15 and the PDFs updated.

Co-Authored-By: Claude Opus 5.5 <noreply@anthropic.com>
Claude-Session: https://claude.ai/code/session_011bX949SUefqNdyAiMwhHmR
</commit_message>
<xml_diff>
--- a/docs/PROJECT_DOCUMENTATION.docx
+++ b/docs/PROJECT_DOCUMENTATION.docx
@@ -117,7 +117,7 @@
         <w:t xml:space="preserve"> </w:t>
       </w:r>
       <w:r>
-        <w:t xml:space="preserve">22 October 2026</w:t>
+        <w:t xml:space="preserve">23 October 2026</w:t>
       </w:r>
       <w:r>
         <w:br/>
@@ -24111,24 +24111,6 @@
       </w:r>
       <w:r>
         <w:t xml:space="preserve">and a Try again button.</w:t>
-      </w:r>
-      <w:r>
-        <w:t xml:space="preserve"> </w:t>
-      </w:r>
-      <w:r>
-        <w:t xml:space="preserve">- A2 (step 5): the customer taps</w:t>
-      </w:r>
-      <w:r>
-        <w:t xml:space="preserve"> </w:t>
-      </w:r>
-      <w:r>
-        <w:t xml:space="preserve">“I’ve paid - check now”</w:t>
-      </w:r>
-      <w:r>
-        <w:t xml:space="preserve"> </w:t>
-      </w:r>
-      <w:r>
-        <w:t xml:space="preserve">to check straight away instead of waiting for the next automatic check.</w:t>
       </w:r>
     </w:p>
     <w:p>

</xml_diff>

<commit_message>
fix(wishlist): a quick second heart tap can't race the first one
The heart updates at once and sends add/remove; a second tap while that
request was still on its way sent the opposite request, and the two could
reach the server in either order (heart off but item saved). Taps on a
product are now ignored until its request is done. The server also treats a
duplicate add at the same moment as already saved instead of a 500.
Claude-Session: https://claude.ai/code/session_01L2MK4BVb8vmpPBvTsaVt4h
</commit_message>
<xml_diff>
--- a/docs/PROJECT_DOCUMENTATION.docx
+++ b/docs/PROJECT_DOCUMENTATION.docx
@@ -49345,7 +49345,7 @@
               <w:rPr>
                 <w:sz w:val="19"/>
               </w:rPr>
-              <w:t xml:space="preserve">143</w:t>
+              <w:t xml:space="preserve">144</w:t>
             </w:r>
           </w:p>
         </w:tc>
@@ -49407,7 +49407,7 @@
               <w:rPr>
                 <w:sz w:val="19"/>
               </w:rPr>
-              <w:t xml:space="preserve">193</w:t>
+              <w:t xml:space="preserve">196</w:t>
             </w:r>
           </w:p>
         </w:tc>

</xml_diff>

<commit_message>
docs: rebuild project doc for the api/ folder; drop stale DFD table
- make_project_doc.py: phone IP now set in mobile/lib/api/api_domain.dart
- REQUIREMENTS.md: remove the old 7-process table left under DFD Level 2
- Regenerated PROJECT_DOCUMENTATION (.md/.docx/.pdf) and REQUIREMENTS
  (.docx/.pdf); this also brings in the DFDs and payment_methods table
Claude-Session: https://claude.ai/code/session_01L2MK4BVb8vmpPBvTsaVt4h
</commit_message>
<xml_diff>
--- a/docs/PROJECT_DOCUMENTATION.docx
+++ b/docs/PROJECT_DOCUMENTATION.docx
@@ -117,7 +117,7 @@
         <w:t xml:space="preserve"> </w:t>
       </w:r>
       <w:r>
-        <w:t xml:space="preserve">23 October 2026</w:t>
+        <w:t xml:space="preserve">27 October 2026</w:t>
       </w:r>
       <w:r>
         <w:br/>
@@ -976,7 +976,7 @@
               <w:rPr>
                 <w:sz w:val="19"/>
               </w:rPr>
-              <w:t xml:space="preserve">MySQL 8 (InnoDB, 16 tables, 19 foreign keys)</w:t>
+              <w:t xml:space="preserve">MySQL 8 (InnoDB, 17 tables, 19 foreign keys)</w:t>
             </w:r>
           </w:p>
         </w:tc>
@@ -12039,7 +12039,7 @@
         <w:pStyle w:val="FirstParagraph"/>
       </w:pPr>
       <w:r>
-        <w:t xml:space="preserve">The system stores 16 entities. The nine suggested in the brief are all present:</w:t>
+        <w:t xml:space="preserve">The system stores 17 entities. The nine suggested in the brief are all present:</w:t>
       </w:r>
     </w:p>
     <w:tbl>
@@ -12564,6 +12564,25 @@
               <w:pStyle w:val="Compact"/>
               <w:spacing w:after="40"/>
             </w:pPr>
+            <w:r>
+              <w:rPr>
+                <w:rStyle w:val="VerbatimChar"/>
+                <w:sz w:val="19"/>
+              </w:rPr>
+              <w:t xml:space="preserve">payment_methods</w:t>
+            </w:r>
+            <w:r>
+              <w:rPr>
+                <w:sz w:val="19"/>
+              </w:rPr>
+              <w:t xml:space="preserve"> </w:t>
+            </w:r>
+            <w:r>
+              <w:rPr>
+                <w:sz w:val="19"/>
+              </w:rPr>
+              <w:t xml:space="preserve">- KHQR, ABA PayWay or cash turned off by the owner</w:t>
+            </w:r>
           </w:p>
         </w:tc>
       </w:tr>
@@ -12618,6 +12637,795 @@
         <w:t xml:space="preserve">Order items copy the product name and unit price at the time of purchase, so old orders stay correct after a price change. Full diagram: ERD (PNG, PDF); full definitions: schema.sql.</w:t>
       </w:r>
     </w:p>
+    <w:p>
+      <w:pPr>
+        <w:pStyle w:val="Heading3"/>
+        <w:keepNext/>
+      </w:pPr>
+      <w:r>
+        <w:t xml:space="preserve">2.8.1 Data flow</w:t>
+      </w:r>
+    </w:p>
+    <w:p>
+      <w:pPr>
+        <w:pStyle w:val="FirstParagraph"/>
+      </w:pPr>
+      <w:r>
+        <w:t xml:space="preserve">How data moves between the people, the system and its stores. Rectangles are outside parties (external entities), numbered circles are processes, open boxes are data stores (Yourdon/DeMarco notation). Source: make_dfd.py.</w:t>
+      </w:r>
+    </w:p>
+    <w:p>
+      <w:pPr>
+        <w:pStyle w:val="BodyText"/>
+      </w:pPr>
+      <w:r>
+        <w:rPr>
+          <w:b/>
+          <w:bCs/>
+        </w:rPr>
+        <w:t xml:space="preserve">Level 0 (main system):</w:t>
+      </w:r>
+      <w:r>
+        <w:t xml:space="preserve"> </w:t>
+      </w:r>
+      <w:r>
+        <w:t xml:space="preserve">the whole shop as one process, with everyone it exchanges data with.</w:t>
+      </w:r>
+    </w:p>
+    <w:p>
+      <w:pPr>
+        <w:pStyle w:val="CaptionedFigure"/>
+      </w:pPr>
+      <w:r>
+        <w:drawing>
+          <wp:inline>
+            <wp:extent cx="5334000" cy="2213610"/>
+            <wp:effectExtent b="0" l="0" r="0" t="0"/>
+            <wp:docPr descr="Data flow diagram, level 0" title="" id="14" name="Picture"/>
+            <a:graphic>
+              <a:graphicData uri="http://schemas.openxmlformats.org/drawingml/2006/picture">
+                <pic:pic>
+                  <pic:nvPicPr>
+                    <pic:cNvPr descr="diagrams/dfd-level-0.png" id="15" name="Picture"/>
+                    <pic:cNvPicPr>
+                      <a:picLocks noChangeArrowheads="1" noChangeAspect="1"/>
+                    </pic:cNvPicPr>
+                  </pic:nvPicPr>
+                  <pic:blipFill>
+                    <a:blip r:embed="rId13"/>
+                    <a:stretch>
+                      <a:fillRect/>
+                    </a:stretch>
+                  </pic:blipFill>
+                  <pic:spPr bwMode="auto">
+                    <a:xfrm>
+                      <a:off x="0" y="0"/>
+                      <a:ext cx="5334000" cy="2213610"/>
+                    </a:xfrm>
+                    <a:prstGeom prst="rect">
+                      <a:avLst/>
+                    </a:prstGeom>
+                    <a:noFill/>
+                    <a:ln w="9525">
+                      <a:noFill/>
+                      <a:headEnd/>
+                      <a:tailEnd/>
+                    </a:ln>
+                  </pic:spPr>
+                </pic:pic>
+              </a:graphicData>
+            </a:graphic>
+          </wp:inline>
+        </w:drawing>
+      </w:r>
+    </w:p>
+    <w:p>
+      <w:pPr>
+        <w:pStyle w:val="ImageCaption"/>
+      </w:pPr>
+      <w:r>
+        <w:t xml:space="preserve">Data flow diagram, level 0</w:t>
+      </w:r>
+    </w:p>
+    <w:p>
+      <w:pPr>
+        <w:pStyle w:val="BodyText"/>
+      </w:pPr>
+      <w:r>
+        <w:rPr>
+          <w:b/>
+          <w:bCs/>
+        </w:rPr>
+        <w:t xml:space="preserve">Level 1 (main functions):</w:t>
+      </w:r>
+      <w:r>
+        <w:t xml:space="preserve"> </w:t>
+      </w:r>
+      <w:r>
+        <w:t xml:space="preserve">the system split into six processes and seven data stores.</w:t>
+      </w:r>
+    </w:p>
+    <w:p>
+      <w:pPr>
+        <w:pStyle w:val="CaptionedFigure"/>
+      </w:pPr>
+      <w:r>
+        <w:drawing>
+          <wp:inline>
+            <wp:extent cx="5334000" cy="2506980"/>
+            <wp:effectExtent b="0" l="0" r="0" t="0"/>
+            <wp:docPr descr="Data flow diagram, level 1" title="" id="17" name="Picture"/>
+            <a:graphic>
+              <a:graphicData uri="http://schemas.openxmlformats.org/drawingml/2006/picture">
+                <pic:pic>
+                  <pic:nvPicPr>
+                    <pic:cNvPr descr="diagrams/dfd-level-1.png" id="18" name="Picture"/>
+                    <pic:cNvPicPr>
+                      <a:picLocks noChangeArrowheads="1" noChangeAspect="1"/>
+                    </pic:cNvPicPr>
+                  </pic:nvPicPr>
+                  <pic:blipFill>
+                    <a:blip r:embed="rId16"/>
+                    <a:stretch>
+                      <a:fillRect/>
+                    </a:stretch>
+                  </pic:blipFill>
+                  <pic:spPr bwMode="auto">
+                    <a:xfrm>
+                      <a:off x="0" y="0"/>
+                      <a:ext cx="5334000" cy="2506980"/>
+                    </a:xfrm>
+                    <a:prstGeom prst="rect">
+                      <a:avLst/>
+                    </a:prstGeom>
+                    <a:noFill/>
+                    <a:ln w="9525">
+                      <a:noFill/>
+                      <a:headEnd/>
+                      <a:tailEnd/>
+                    </a:ln>
+                  </pic:spPr>
+                </pic:pic>
+              </a:graphicData>
+            </a:graphic>
+          </wp:inline>
+        </w:drawing>
+      </w:r>
+    </w:p>
+    <w:p>
+      <w:pPr>
+        <w:pStyle w:val="ImageCaption"/>
+      </w:pPr>
+      <w:r>
+        <w:t xml:space="preserve">Data flow diagram, level 1</w:t>
+      </w:r>
+    </w:p>
+    <w:tbl>
+      <w:tblPr>
+        <w:tblStyle w:val="Table"/>
+        <w:tblW w:type="pct" w:w="5000"/>
+        <w:tblLayout w:type="fixed"/>
+        <w:tblLook w:firstRow="1" w:lastRow="0" w:firstColumn="0" w:lastColumn="0" w:noHBand="0" w:noVBand="0" w:val="0020"/>
+        <w:jc w:val="center"/>
+        <w:tblBorders>
+          <w:top w:val="single" w:sz="4" w:color="94A3B8"/>
+          <w:left w:val="single" w:sz="4" w:color="94A3B8"/>
+          <w:bottom w:val="single" w:sz="4" w:color="94A3B8"/>
+          <w:right w:val="single" w:sz="4" w:color="94A3B8"/>
+          <w:insideH w:val="single" w:sz="4" w:color="94A3B8"/>
+          <w:insideV w:val="single" w:sz="4" w:color="94A3B8"/>
+        </w:tblBorders>
+      </w:tblPr>
+      <w:tblGrid>
+        <w:gridCol w:w="2640"/>
+        <w:gridCol w:w="2640"/>
+        <w:gridCol w:w="2640"/>
+      </w:tblGrid>
+      <w:tr>
+        <w:trPr>
+          <w:tblHeader w:val="on"/>
+        </w:trPr>
+        <w:tc>
+          <w:tcPr>
+            <w:shd w:val="clear" w:fill="E0F2FE"/>
+          </w:tcPr>
+          <w:p>
+            <w:pPr>
+              <w:pStyle w:val="Compact"/>
+              <w:spacing w:after="40"/>
+            </w:pPr>
+            <w:r>
+              <w:rPr>
+                <w:b/>
+                <w:sz w:val="19"/>
+              </w:rPr>
+              <w:t xml:space="preserve">Process</w:t>
+            </w:r>
+          </w:p>
+        </w:tc>
+        <w:tc>
+          <w:tcPr>
+            <w:shd w:val="clear" w:fill="E0F2FE"/>
+          </w:tcPr>
+          <w:p>
+            <w:pPr>
+              <w:pStyle w:val="Compact"/>
+              <w:spacing w:after="40"/>
+            </w:pPr>
+            <w:r>
+              <w:rPr>
+                <w:b/>
+                <w:sz w:val="19"/>
+              </w:rPr>
+              <w:t xml:space="preserve">What it does</w:t>
+            </w:r>
+          </w:p>
+        </w:tc>
+        <w:tc>
+          <w:tcPr>
+            <w:shd w:val="clear" w:fill="E0F2FE"/>
+          </w:tcPr>
+          <w:p>
+            <w:pPr>
+              <w:pStyle w:val="Compact"/>
+              <w:spacing w:after="40"/>
+            </w:pPr>
+            <w:r>
+              <w:rPr>
+                <w:b/>
+                <w:sz w:val="19"/>
+              </w:rPr>
+              <w:t xml:space="preserve">Data stores</w:t>
+            </w:r>
+          </w:p>
+        </w:tc>
+      </w:tr>
+      <w:tr>
+        <w:tc>
+          <w:tcPr/>
+          <w:p>
+            <w:pPr>
+              <w:pStyle w:val="Compact"/>
+              <w:spacing w:after="40"/>
+            </w:pPr>
+            <w:r>
+              <w:rPr>
+                <w:sz w:val="19"/>
+              </w:rPr>
+              <w:t xml:space="preserve">1.0 User &amp; Profile Management</w:t>
+            </w:r>
+          </w:p>
+        </w:tc>
+        <w:tc>
+          <w:tcPr/>
+          <w:p>
+            <w:pPr>
+              <w:pStyle w:val="Compact"/>
+              <w:spacing w:after="40"/>
+            </w:pPr>
+            <w:r>
+              <w:rPr>
+                <w:sz w:val="19"/>
+              </w:rPr>
+              <w:t xml:space="preserve">Register, log in, edit the profile, reset a forgotten password by email code</w:t>
+            </w:r>
+          </w:p>
+        </w:tc>
+        <w:tc>
+          <w:tcPr/>
+          <w:p>
+            <w:pPr>
+              <w:pStyle w:val="Compact"/>
+              <w:spacing w:after="40"/>
+            </w:pPr>
+            <w:r>
+              <w:rPr>
+                <w:sz w:val="19"/>
+              </w:rPr>
+              <w:t xml:space="preserve">D1 Users</w:t>
+            </w:r>
+          </w:p>
+        </w:tc>
+      </w:tr>
+      <w:tr>
+        <w:tc>
+          <w:tcPr/>
+          <w:p>
+            <w:pPr>
+              <w:pStyle w:val="Compact"/>
+              <w:spacing w:after="40"/>
+            </w:pPr>
+            <w:r>
+              <w:rPr>
+                <w:sz w:val="19"/>
+              </w:rPr>
+              <w:t xml:space="preserve">2.0 Catalog Browsing &amp; Search</w:t>
+            </w:r>
+          </w:p>
+        </w:tc>
+        <w:tc>
+          <w:tcPr/>
+          <w:p>
+            <w:pPr>
+              <w:pStyle w:val="Compact"/>
+              <w:spacing w:after="40"/>
+            </w:pPr>
+            <w:r>
+              <w:rPr>
+                <w:sz w:val="19"/>
+              </w:rPr>
+              <w:t xml:space="preserve">Home, categories, search with suggestions, filters</w:t>
+            </w:r>
+          </w:p>
+        </w:tc>
+        <w:tc>
+          <w:tcPr/>
+          <w:p>
+            <w:pPr>
+              <w:pStyle w:val="Compact"/>
+              <w:spacing w:after="40"/>
+            </w:pPr>
+            <w:r>
+              <w:rPr>
+                <w:sz w:val="19"/>
+              </w:rPr>
+              <w:t xml:space="preserve">D2 Products &amp; Categories</w:t>
+            </w:r>
+          </w:p>
+        </w:tc>
+      </w:tr>
+      <w:tr>
+        <w:tc>
+          <w:tcPr/>
+          <w:p>
+            <w:pPr>
+              <w:pStyle w:val="Compact"/>
+              <w:spacing w:after="40"/>
+            </w:pPr>
+            <w:r>
+              <w:rPr>
+                <w:sz w:val="19"/>
+              </w:rPr>
+              <w:t xml:space="preserve">3.0 Cart &amp; Checkout</w:t>
+            </w:r>
+          </w:p>
+        </w:tc>
+        <w:tc>
+          <w:tcPr/>
+          <w:p>
+            <w:pPr>
+              <w:pStyle w:val="Compact"/>
+              <w:spacing w:after="40"/>
+            </w:pPr>
+            <w:r>
+              <w:rPr>
+                <w:sz w:val="19"/>
+              </w:rPr>
+              <w:t xml:space="preserve">Cart lines, promo code, stock check, save the order</w:t>
+            </w:r>
+          </w:p>
+        </w:tc>
+        <w:tc>
+          <w:tcPr/>
+          <w:p>
+            <w:pPr>
+              <w:pStyle w:val="Compact"/>
+              <w:spacing w:after="40"/>
+            </w:pPr>
+            <w:r>
+              <w:rPr>
+                <w:sz w:val="19"/>
+              </w:rPr>
+              <w:t xml:space="preserve">D3 Cart &amp; Favorites, D7 Coupons &amp; Pay Methods, D4 Orders</w:t>
+            </w:r>
+          </w:p>
+        </w:tc>
+      </w:tr>
+      <w:tr>
+        <w:tc>
+          <w:tcPr/>
+          <w:p>
+            <w:pPr>
+              <w:pStyle w:val="Compact"/>
+              <w:spacing w:after="40"/>
+            </w:pPr>
+            <w:r>
+              <w:rPr>
+                <w:sz w:val="19"/>
+              </w:rPr>
+              <w:t xml:space="preserve">4.0 Payment Processing</w:t>
+            </w:r>
+          </w:p>
+        </w:tc>
+        <w:tc>
+          <w:tcPr/>
+          <w:p>
+            <w:pPr>
+              <w:pStyle w:val="Compact"/>
+              <w:spacing w:after="40"/>
+            </w:pPr>
+            <w:r>
+              <w:rPr>
+                <w:sz w:val="19"/>
+              </w:rPr>
+              <w:t xml:space="preserve">Ask Bakong or ABA PayWay for a QR, watch for the payment, mark the order paid</w:t>
+            </w:r>
+          </w:p>
+        </w:tc>
+        <w:tc>
+          <w:tcPr/>
+          <w:p>
+            <w:pPr>
+              <w:pStyle w:val="Compact"/>
+              <w:spacing w:after="40"/>
+            </w:pPr>
+            <w:r>
+              <w:rPr>
+                <w:sz w:val="19"/>
+              </w:rPr>
+              <w:t xml:space="preserve">D5 Payments, D4 Orders</w:t>
+            </w:r>
+          </w:p>
+        </w:tc>
+      </w:tr>
+      <w:tr>
+        <w:tc>
+          <w:tcPr/>
+          <w:p>
+            <w:pPr>
+              <w:pStyle w:val="Compact"/>
+              <w:spacing w:after="40"/>
+            </w:pPr>
+            <w:r>
+              <w:rPr>
+                <w:sz w:val="19"/>
+              </w:rPr>
+              <w:t xml:space="preserve">5.0 Order Tracking &amp; Notifications</w:t>
+            </w:r>
+          </w:p>
+        </w:tc>
+        <w:tc>
+          <w:tcPr/>
+          <w:p>
+            <w:pPr>
+              <w:pStyle w:val="Compact"/>
+              <w:spacing w:after="40"/>
+            </w:pPr>
+            <w:r>
+              <w:rPr>
+                <w:sz w:val="19"/>
+              </w:rPr>
+              <w:t xml:space="preserve">Order tracker and a notification at every step</w:t>
+            </w:r>
+          </w:p>
+        </w:tc>
+        <w:tc>
+          <w:tcPr/>
+          <w:p>
+            <w:pPr>
+              <w:pStyle w:val="Compact"/>
+              <w:spacing w:after="40"/>
+            </w:pPr>
+            <w:r>
+              <w:rPr>
+                <w:sz w:val="19"/>
+              </w:rPr>
+              <w:t xml:space="preserve">D4 Orders, D6 Notifications</w:t>
+            </w:r>
+          </w:p>
+        </w:tc>
+      </w:tr>
+      <w:tr>
+        <w:tc>
+          <w:tcPr/>
+          <w:p>
+            <w:pPr>
+              <w:pStyle w:val="Compact"/>
+              <w:spacing w:after="40"/>
+            </w:pPr>
+            <w:r>
+              <w:rPr>
+                <w:sz w:val="19"/>
+              </w:rPr>
+              <w:t xml:space="preserve">6.0 Shop Administration</w:t>
+            </w:r>
+          </w:p>
+        </w:tc>
+        <w:tc>
+          <w:tcPr/>
+          <w:p>
+            <w:pPr>
+              <w:pStyle w:val="Compact"/>
+              <w:spacing w:after="40"/>
+            </w:pPr>
+            <w:r>
+              <w:rPr>
+                <w:sz w:val="19"/>
+              </w:rPr>
+              <w:t xml:space="preserve">Staff and owner: products, stock, order steps, staff accounts, promo codes, payment methods</w:t>
+            </w:r>
+          </w:p>
+        </w:tc>
+        <w:tc>
+          <w:tcPr/>
+          <w:p>
+            <w:pPr>
+              <w:pStyle w:val="Compact"/>
+              <w:spacing w:after="40"/>
+            </w:pPr>
+            <w:r>
+              <w:rPr>
+                <w:sz w:val="19"/>
+              </w:rPr>
+              <w:t xml:space="preserve">D2, D4, D7</w:t>
+            </w:r>
+          </w:p>
+        </w:tc>
+      </w:tr>
+    </w:tbl>
+    <w:p>
+      <w:pPr>
+        <w:pStyle w:val="BodyText"/>
+      </w:pPr>
+      <w:r>
+        <w:rPr>
+          <w:b/>
+          <w:bCs/>
+        </w:rPr>
+        <w:t xml:space="preserve">Level 2 (process 3.0 Cart &amp; Checkout):</w:t>
+      </w:r>
+      <w:r>
+        <w:t xml:space="preserve"> </w:t>
+      </w:r>
+      <w:r>
+        <w:t xml:space="preserve">the busiest process, split into its four steps.</w:t>
+      </w:r>
+    </w:p>
+    <w:p>
+      <w:pPr>
+        <w:pStyle w:val="CaptionedFigure"/>
+      </w:pPr>
+      <w:r>
+        <w:drawing>
+          <wp:inline>
+            <wp:extent cx="5334000" cy="2400300"/>
+            <wp:effectExtent b="0" l="0" r="0" t="0"/>
+            <wp:docPr descr="Data flow diagram, level 2: 3.0 Cart and Checkout" title="" id="20" name="Picture"/>
+            <a:graphic>
+              <a:graphicData uri="http://schemas.openxmlformats.org/drawingml/2006/picture">
+                <pic:pic>
+                  <pic:nvPicPr>
+                    <pic:cNvPr descr="diagrams/dfd-level-2.png" id="21" name="Picture"/>
+                    <pic:cNvPicPr>
+                      <a:picLocks noChangeArrowheads="1" noChangeAspect="1"/>
+                    </pic:cNvPicPr>
+                  </pic:nvPicPr>
+                  <pic:blipFill>
+                    <a:blip r:embed="rId19"/>
+                    <a:stretch>
+                      <a:fillRect/>
+                    </a:stretch>
+                  </pic:blipFill>
+                  <pic:spPr bwMode="auto">
+                    <a:xfrm>
+                      <a:off x="0" y="0"/>
+                      <a:ext cx="5334000" cy="2400300"/>
+                    </a:xfrm>
+                    <a:prstGeom prst="rect">
+                      <a:avLst/>
+                    </a:prstGeom>
+                    <a:noFill/>
+                    <a:ln w="9525">
+                      <a:noFill/>
+                      <a:headEnd/>
+                      <a:tailEnd/>
+                    </a:ln>
+                  </pic:spPr>
+                </pic:pic>
+              </a:graphicData>
+            </a:graphic>
+          </wp:inline>
+        </w:drawing>
+      </w:r>
+    </w:p>
+    <w:p>
+      <w:pPr>
+        <w:pStyle w:val="ImageCaption"/>
+      </w:pPr>
+      <w:r>
+        <w:t xml:space="preserve">Data flow diagram, level 2: 3.0 Cart and Checkout</w:t>
+      </w:r>
+    </w:p>
+    <w:tbl>
+      <w:tblPr>
+        <w:tblStyle w:val="Table"/>
+        <w:tblW w:type="pct" w:w="5000"/>
+        <w:tblLayout w:type="fixed"/>
+        <w:tblLook w:firstRow="1" w:lastRow="0" w:firstColumn="0" w:lastColumn="0" w:noHBand="0" w:noVBand="0" w:val="0020"/>
+        <w:jc w:val="center"/>
+        <w:tblBorders>
+          <w:top w:val="single" w:sz="4" w:color="94A3B8"/>
+          <w:left w:val="single" w:sz="4" w:color="94A3B8"/>
+          <w:bottom w:val="single" w:sz="4" w:color="94A3B8"/>
+          <w:right w:val="single" w:sz="4" w:color="94A3B8"/>
+          <w:insideH w:val="single" w:sz="4" w:color="94A3B8"/>
+          <w:insideV w:val="single" w:sz="4" w:color="94A3B8"/>
+        </w:tblBorders>
+      </w:tblPr>
+      <w:tblGrid>
+        <w:gridCol w:w="3960"/>
+        <w:gridCol w:w="3960"/>
+      </w:tblGrid>
+      <w:tr>
+        <w:trPr>
+          <w:tblHeader w:val="on"/>
+        </w:trPr>
+        <w:tc>
+          <w:tcPr>
+            <w:shd w:val="clear" w:fill="E0F2FE"/>
+          </w:tcPr>
+          <w:p>
+            <w:pPr>
+              <w:pStyle w:val="Compact"/>
+              <w:spacing w:after="40"/>
+            </w:pPr>
+            <w:r>
+              <w:rPr>
+                <w:b/>
+                <w:sz w:val="19"/>
+              </w:rPr>
+              <w:t xml:space="preserve">Step</w:t>
+            </w:r>
+          </w:p>
+        </w:tc>
+        <w:tc>
+          <w:tcPr>
+            <w:shd w:val="clear" w:fill="E0F2FE"/>
+          </w:tcPr>
+          <w:p>
+            <w:pPr>
+              <w:pStyle w:val="Compact"/>
+              <w:spacing w:after="40"/>
+            </w:pPr>
+            <w:r>
+              <w:rPr>
+                <w:b/>
+                <w:sz w:val="19"/>
+              </w:rPr>
+              <w:t xml:space="preserve">What it does</w:t>
+            </w:r>
+          </w:p>
+        </w:tc>
+      </w:tr>
+      <w:tr>
+        <w:tc>
+          <w:tcPr/>
+          <w:p>
+            <w:pPr>
+              <w:pStyle w:val="Compact"/>
+              <w:spacing w:after="40"/>
+            </w:pPr>
+            <w:r>
+              <w:rPr>
+                <w:sz w:val="19"/>
+              </w:rPr>
+              <w:t xml:space="preserve">3.1 Manage Cart</w:t>
+            </w:r>
+          </w:p>
+        </w:tc>
+        <w:tc>
+          <w:tcPr/>
+          <w:p>
+            <w:pPr>
+              <w:pStyle w:val="Compact"/>
+              <w:spacing w:after="40"/>
+            </w:pPr>
+            <w:r>
+              <w:rPr>
+                <w:sz w:val="19"/>
+              </w:rPr>
+              <w:t xml:space="preserve">Add, change the quantity or remove items; says when stock runs short</w:t>
+            </w:r>
+          </w:p>
+        </w:tc>
+      </w:tr>
+      <w:tr>
+        <w:tc>
+          <w:tcPr/>
+          <w:p>
+            <w:pPr>
+              <w:pStyle w:val="Compact"/>
+              <w:spacing w:after="40"/>
+            </w:pPr>
+            <w:r>
+              <w:rPr>
+                <w:sz w:val="19"/>
+              </w:rPr>
+              <w:t xml:space="preserve">3.2 Price &amp; Promo Code</w:t>
+            </w:r>
+          </w:p>
+        </w:tc>
+        <w:tc>
+          <w:tcPr/>
+          <w:p>
+            <w:pPr>
+              <w:pStyle w:val="Compact"/>
+              <w:spacing w:after="40"/>
+            </w:pPr>
+            <w:r>
+              <w:rPr>
+                <w:sz w:val="19"/>
+              </w:rPr>
+              <w:t xml:space="preserve">Subtotal, promo discount and delivery fee; only payment methods that are on are offered</w:t>
+            </w:r>
+          </w:p>
+        </w:tc>
+      </w:tr>
+      <w:tr>
+        <w:tc>
+          <w:tcPr/>
+          <w:p>
+            <w:pPr>
+              <w:pStyle w:val="Compact"/>
+              <w:spacing w:after="40"/>
+            </w:pPr>
+            <w:r>
+              <w:rPr>
+                <w:sz w:val="19"/>
+              </w:rPr>
+              <w:t xml:space="preserve">3.3 Check Stock &amp; Save Order</w:t>
+            </w:r>
+          </w:p>
+        </w:tc>
+        <w:tc>
+          <w:tcPr/>
+          <w:p>
+            <w:pPr>
+              <w:pStyle w:val="Compact"/>
+              <w:spacing w:after="40"/>
+            </w:pPr>
+            <w:r>
+              <w:rPr>
+                <w:sz w:val="19"/>
+              </w:rPr>
+              <w:t xml:space="preserve">Checks the stock again, takes it and saves the order, so nothing is sold twice</w:t>
+            </w:r>
+          </w:p>
+        </w:tc>
+      </w:tr>
+      <w:tr>
+        <w:tc>
+          <w:tcPr/>
+          <w:p>
+            <w:pPr>
+              <w:pStyle w:val="Compact"/>
+              <w:spacing w:after="40"/>
+            </w:pPr>
+            <w:r>
+              <w:rPr>
+                <w:sz w:val="19"/>
+              </w:rPr>
+              <w:t xml:space="preserve">3.4 Choose Payment</w:t>
+            </w:r>
+          </w:p>
+        </w:tc>
+        <w:tc>
+          <w:tcPr/>
+          <w:p>
+            <w:pPr>
+              <w:pStyle w:val="Compact"/>
+              <w:spacing w:after="40"/>
+            </w:pPr>
+            <w:r>
+              <w:rPr>
+                <w:sz w:val="19"/>
+              </w:rPr>
+              <w:t xml:space="preserve">KHQR or ABA goes to 4.0 Payment Processing; cash is confirmed straight away and goes to 5.0 Order Tracking</w:t>
+            </w:r>
+          </w:p>
+        </w:tc>
+      </w:tr>
+    </w:tbl>
     <w:p>
       <w:pPr>
         <w:pStyle w:val="Heading2"/>
@@ -18838,18 +19646,18 @@
           <wp:inline>
             <wp:extent cx="3447703" cy="7223760"/>
             <wp:effectExtent b="0" l="0" r="0" t="0"/>
-            <wp:docPr descr="Use case overview" title="" id="14" name="Picture"/>
+            <wp:docPr descr="Use case overview" title="" id="23" name="Picture"/>
             <a:graphic>
               <a:graphicData uri="http://schemas.openxmlformats.org/drawingml/2006/picture">
                 <pic:pic>
                   <pic:nvPicPr>
-                    <pic:cNvPr descr="diagrams/use-case-overview.png" id="15" name="Picture"/>
+                    <pic:cNvPr descr="diagrams/use-case-overview.png" id="24" name="Picture"/>
                     <pic:cNvPicPr>
                       <a:picLocks noChangeArrowheads="1" noChangeAspect="1"/>
                     </pic:cNvPicPr>
                   </pic:nvPicPr>
                   <pic:blipFill>
-                    <a:blip r:embed="rId13"/>
+                    <a:blip r:embed="rId22"/>
                     <a:stretch>
                       <a:fillRect/>
                     </a:stretch>
@@ -18934,18 +19742,18 @@
           <wp:inline>
             <wp:extent cx="4197102" cy="7223760"/>
             <wp:effectExtent b="0" l="0" r="0" t="0"/>
-            <wp:docPr descr="Customer use cases - browse, cart and wishlist" title="" id="17" name="Picture"/>
+            <wp:docPr descr="Customer use cases - browse, cart and wishlist" title="" id="26" name="Picture"/>
             <a:graphic>
               <a:graphicData uri="http://schemas.openxmlformats.org/drawingml/2006/picture">
                 <pic:pic>
                   <pic:nvPicPr>
-                    <pic:cNvPr descr="diagrams/use-case-customer-shopping.png" id="18" name="Picture"/>
+                    <pic:cNvPr descr="diagrams/use-case-customer-shopping.png" id="27" name="Picture"/>
                     <pic:cNvPicPr>
                       <a:picLocks noChangeArrowheads="1" noChangeAspect="1"/>
                     </pic:cNvPicPr>
                   </pic:nvPicPr>
                   <pic:blipFill>
-                    <a:blip r:embed="rId16"/>
+                    <a:blip r:embed="rId25"/>
                     <a:stretch>
                       <a:fillRect/>
                     </a:stretch>
@@ -18998,18 +19806,18 @@
           <wp:inline>
             <wp:extent cx="4718865" cy="7223760"/>
             <wp:effectExtent b="0" l="0" r="0" t="0"/>
-            <wp:docPr descr="Customer use cases - checkout and orders" title="" id="20" name="Picture"/>
+            <wp:docPr descr="Customer use cases - checkout and orders" title="" id="29" name="Picture"/>
             <a:graphic>
               <a:graphicData uri="http://schemas.openxmlformats.org/drawingml/2006/picture">
                 <pic:pic>
                   <pic:nvPicPr>
-                    <pic:cNvPr descr="diagrams/use-case-customer-orders.png" id="21" name="Picture"/>
+                    <pic:cNvPr descr="diagrams/use-case-customer-orders.png" id="30" name="Picture"/>
                     <pic:cNvPicPr>
                       <a:picLocks noChangeArrowheads="1" noChangeAspect="1"/>
                     </pic:cNvPicPr>
                   </pic:nvPicPr>
                   <pic:blipFill>
-                    <a:blip r:embed="rId19"/>
+                    <a:blip r:embed="rId28"/>
                     <a:stretch>
                       <a:fillRect/>
                     </a:stretch>
@@ -19062,18 +19870,18 @@
           <wp:inline>
             <wp:extent cx="5334000" cy="6127370"/>
             <wp:effectExtent b="0" l="0" r="0" t="0"/>
-            <wp:docPr descr="Customer use cases - account and support" title="" id="23" name="Picture"/>
+            <wp:docPr descr="Customer use cases - account and support" title="" id="32" name="Picture"/>
             <a:graphic>
               <a:graphicData uri="http://schemas.openxmlformats.org/drawingml/2006/picture">
                 <pic:pic>
                   <pic:nvPicPr>
-                    <pic:cNvPr descr="diagrams/use-case-customer-account.png" id="24" name="Picture"/>
+                    <pic:cNvPr descr="diagrams/use-case-customer-account.png" id="33" name="Picture"/>
                     <pic:cNvPicPr>
                       <a:picLocks noChangeArrowheads="1" noChangeAspect="1"/>
                     </pic:cNvPicPr>
                   </pic:nvPicPr>
                   <pic:blipFill>
-                    <a:blip r:embed="rId22"/>
+                    <a:blip r:embed="rId31"/>
                     <a:stretch>
                       <a:fillRect/>
                     </a:stretch>
@@ -19126,18 +19934,18 @@
           <wp:inline>
             <wp:extent cx="3342336" cy="7223760"/>
             <wp:effectExtent b="0" l="0" r="0" t="0"/>
-            <wp:docPr descr="Admin use cases" title="" id="26" name="Picture"/>
+            <wp:docPr descr="Admin use cases" title="" id="35" name="Picture"/>
             <a:graphic>
               <a:graphicData uri="http://schemas.openxmlformats.org/drawingml/2006/picture">
                 <pic:pic>
                   <pic:nvPicPr>
-                    <pic:cNvPr descr="diagrams/use-case-admin.png" id="27" name="Picture"/>
+                    <pic:cNvPr descr="diagrams/use-case-admin.png" id="36" name="Picture"/>
                     <pic:cNvPicPr>
                       <a:picLocks noChangeArrowheads="1" noChangeAspect="1"/>
                     </pic:cNvPicPr>
                   </pic:nvPicPr>
                   <pic:blipFill>
-                    <a:blip r:embed="rId25"/>
+                    <a:blip r:embed="rId34"/>
                     <a:stretch>
                       <a:fillRect/>
                     </a:stretch>
@@ -27028,18 +27836,18 @@
           <wp:inline>
             <wp:extent cx="5334000" cy="3529283"/>
             <wp:effectExtent b="0" l="0" r="0" t="0"/>
-            <wp:docPr descr="Overview ER diagram" title="" id="29" name="Picture"/>
+            <wp:docPr descr="Overview ER diagram" title="" id="38" name="Picture"/>
             <a:graphic>
               <a:graphicData uri="http://schemas.openxmlformats.org/drawingml/2006/picture">
                 <pic:pic>
                   <pic:nvPicPr>
-                    <pic:cNvPr descr="database/erd.png" id="30" name="Picture"/>
+                    <pic:cNvPr descr="database/erd.png" id="39" name="Picture"/>
                     <pic:cNvPicPr>
                       <a:picLocks noChangeArrowheads="1" noChangeAspect="1"/>
                     </pic:cNvPicPr>
                   </pic:nvPicPr>
                   <pic:blipFill>
-                    <a:blip r:embed="rId28"/>
+                    <a:blip r:embed="rId37"/>
                     <a:stretch>
                       <a:fillRect/>
                     </a:stretch>
@@ -27112,18 +27920,18 @@
           <wp:inline>
             <wp:extent cx="5334000" cy="3160317"/>
             <wp:effectExtent b="0" l="0" r="0" t="0"/>
-            <wp:docPr descr="Detailed ER diagram" title="" id="32" name="Picture"/>
+            <wp:docPr descr="Detailed ER diagram" title="" id="41" name="Picture"/>
             <a:graphic>
               <a:graphicData uri="http://schemas.openxmlformats.org/drawingml/2006/picture">
                 <pic:pic>
                   <pic:nvPicPr>
-                    <pic:cNvPr descr="database/erd-diagram.png" id="33" name="Picture"/>
+                    <pic:cNvPr descr="database/erd-diagram.png" id="42" name="Picture"/>
                     <pic:cNvPicPr>
                       <a:picLocks noChangeArrowheads="1" noChangeAspect="1"/>
                     </pic:cNvPicPr>
                   </pic:nvPicPr>
                   <pic:blipFill>
-                    <a:blip r:embed="rId31"/>
+                    <a:blip r:embed="rId40"/>
                     <a:stretch>
                       <a:fillRect/>
                     </a:stretch>
@@ -28520,7 +29328,7 @@
       <w:r>
         <w:t xml:space="preserve"> </w:t>
       </w:r>
-      <w:hyperlink r:id="rId34">
+      <w:hyperlink r:id="rId43">
         <w:r>
           <w:rPr>
             <w:rStyle w:val="Hyperlink"/>
@@ -36410,7 +37218,49 @@
         <w:t xml:space="preserve"> </w:t>
       </w:r>
       <w:r>
-        <w:t xml:space="preserve">+ {delivery_method: string, delivery_options: list of {id, label, detail, fee}, addresses: list of</w:t>
+        <w:t xml:space="preserve">+ {delivery_method: string, delivery_options: list of {id, label, detail, fee}, payment_methods: list of</w:t>
+      </w:r>
+      <w:r>
+        <w:t xml:space="preserve"> </w:t>
+      </w:r>
+      <w:r>
+        <w:rPr>
+          <w:rStyle w:val="VerbatimChar"/>
+        </w:rPr>
+        <w:t xml:space="preserve">khqr</w:t>
+      </w:r>
+      <w:r>
+        <w:t xml:space="preserve"> </w:t>
+      </w:r>
+      <w:r>
+        <w:t xml:space="preserve">|</w:t>
+      </w:r>
+      <w:r>
+        <w:t xml:space="preserve"> </w:t>
+      </w:r>
+      <w:r>
+        <w:rPr>
+          <w:rStyle w:val="VerbatimChar"/>
+        </w:rPr>
+        <w:t xml:space="preserve">aba</w:t>
+      </w:r>
+      <w:r>
+        <w:t xml:space="preserve"> </w:t>
+      </w:r>
+      <w:r>
+        <w:t xml:space="preserve">|</w:t>
+      </w:r>
+      <w:r>
+        <w:t xml:space="preserve"> </w:t>
+      </w:r>
+      <w:r>
+        <w:rPr>
+          <w:rStyle w:val="VerbatimChar"/>
+        </w:rPr>
+        <w:t xml:space="preserve">cod</w:t>
+      </w:r>
+      <w:r>
+        <w:t xml:space="preserve">, addresses: list of</w:t>
       </w:r>
       <w:r>
         <w:t xml:space="preserve"> </w:t>
@@ -36526,7 +37376,7 @@
         <w:pStyle w:val="BodyText"/>
       </w:pPr>
       <w:r>
-        <w:t xml:space="preserve">Lowers stock and empties the cart. Store pickup is free and needs no address. 409 if an item sold out meanwhile.</w:t>
+        <w:t xml:space="preserve">Lowers stock and empties the cart. Store pickup is free and needs no address. 409 if an item sold out meanwhile or the payment method was turned off by the shop.</w:t>
       </w:r>
     </w:p>
     <w:p>
@@ -42254,22 +43104,22 @@
                 <w:rStyle w:val="VerbatimChar"/>
                 <w:sz w:val="19"/>
               </w:rPr>
-              <w:t xml:space="preserve">/api/admin/reviews</w:t>
-            </w:r>
-          </w:p>
-        </w:tc>
-        <w:tc>
-          <w:tcPr/>
-          <w:p>
-            <w:pPr>
-              <w:pStyle w:val="Compact"/>
-              <w:spacing w:after="40"/>
-            </w:pPr>
-            <w:r>
-              <w:rPr>
-                <w:sz w:val="19"/>
-              </w:rPr>
-              <w:t xml:space="preserve">All reviews, newest first</w:t>
+              <w:t xml:space="preserve">/api/admin/payment-methods</w:t>
+            </w:r>
+          </w:p>
+        </w:tc>
+        <w:tc>
+          <w:tcPr/>
+          <w:p>
+            <w:pPr>
+              <w:pStyle w:val="Compact"/>
+              <w:spacing w:after="40"/>
+            </w:pPr>
+            <w:r>
+              <w:rPr>
+                <w:sz w:val="19"/>
+              </w:rPr>
+              <w:t xml:space="preserve">KHQR, ABA PayWay and cash: on or off (admin only)</w:t>
             </w:r>
           </w:p>
         </w:tc>
@@ -42302,6 +43152,134 @@
                 <w:rStyle w:val="VerbatimChar"/>
                 <w:sz w:val="19"/>
               </w:rPr>
+              <w:t xml:space="preserve">PUT</w:t>
+            </w:r>
+          </w:p>
+        </w:tc>
+        <w:tc>
+          <w:tcPr/>
+          <w:p>
+            <w:pPr>
+              <w:pStyle w:val="Compact"/>
+              <w:spacing w:after="40"/>
+            </w:pPr>
+            <w:r>
+              <w:rPr>
+                <w:rStyle w:val="VerbatimChar"/>
+                <w:sz w:val="19"/>
+              </w:rPr>
+              <w:t xml:space="preserve">/api/admin/payment-methods/{method}</w:t>
+            </w:r>
+          </w:p>
+        </w:tc>
+        <w:tc>
+          <w:tcPr/>
+          <w:p>
+            <w:pPr>
+              <w:pStyle w:val="Compact"/>
+              <w:spacing w:after="40"/>
+            </w:pPr>
+            <w:r>
+              <w:rPr>
+                <w:sz w:val="19"/>
+              </w:rPr>
+              <w:t xml:space="preserve">Turn a payment method on or off (admin only)</w:t>
+            </w:r>
+          </w:p>
+        </w:tc>
+        <w:tc>
+          <w:tcPr/>
+          <w:p>
+            <w:pPr>
+              <w:pStyle w:val="Compact"/>
+              <w:spacing w:after="40"/>
+            </w:pPr>
+            <w:r>
+              <w:rPr>
+                <w:sz w:val="19"/>
+              </w:rPr>
+              <w:t xml:space="preserve">admin</w:t>
+            </w:r>
+          </w:p>
+        </w:tc>
+      </w:tr>
+      <w:tr>
+        <w:tc>
+          <w:tcPr/>
+          <w:p>
+            <w:pPr>
+              <w:pStyle w:val="Compact"/>
+              <w:spacing w:after="40"/>
+            </w:pPr>
+            <w:r>
+              <w:rPr>
+                <w:rStyle w:val="VerbatimChar"/>
+                <w:sz w:val="19"/>
+              </w:rPr>
+              <w:t xml:space="preserve">GET</w:t>
+            </w:r>
+          </w:p>
+        </w:tc>
+        <w:tc>
+          <w:tcPr/>
+          <w:p>
+            <w:pPr>
+              <w:pStyle w:val="Compact"/>
+              <w:spacing w:after="40"/>
+            </w:pPr>
+            <w:r>
+              <w:rPr>
+                <w:rStyle w:val="VerbatimChar"/>
+                <w:sz w:val="19"/>
+              </w:rPr>
+              <w:t xml:space="preserve">/api/admin/reviews</w:t>
+            </w:r>
+          </w:p>
+        </w:tc>
+        <w:tc>
+          <w:tcPr/>
+          <w:p>
+            <w:pPr>
+              <w:pStyle w:val="Compact"/>
+              <w:spacing w:after="40"/>
+            </w:pPr>
+            <w:r>
+              <w:rPr>
+                <w:sz w:val="19"/>
+              </w:rPr>
+              <w:t xml:space="preserve">All reviews, newest first</w:t>
+            </w:r>
+          </w:p>
+        </w:tc>
+        <w:tc>
+          <w:tcPr/>
+          <w:p>
+            <w:pPr>
+              <w:pStyle w:val="Compact"/>
+              <w:spacing w:after="40"/>
+            </w:pPr>
+            <w:r>
+              <w:rPr>
+                <w:sz w:val="19"/>
+              </w:rPr>
+              <w:t xml:space="preserve">admin</w:t>
+            </w:r>
+          </w:p>
+        </w:tc>
+      </w:tr>
+      <w:tr>
+        <w:tc>
+          <w:tcPr/>
+          <w:p>
+            <w:pPr>
+              <w:pStyle w:val="Compact"/>
+              <w:spacing w:after="40"/>
+            </w:pPr>
+            <w:r>
+              <w:rPr>
+                <w:rStyle w:val="VerbatimChar"/>
+                <w:sz w:val="19"/>
+              </w:rPr>
               <w:t xml:space="preserve">DELETE</w:t>
             </w:r>
           </w:p>
@@ -46134,7 +47112,7 @@
         <w:rPr>
           <w:rStyle w:val="VerbatimChar"/>
         </w:rPr>
-        <w:t xml:space="preserve">GET /api/admin/reviews</w:t>
+        <w:t xml:space="preserve">GET /api/admin/payment-methods</w:t>
       </w:r>
     </w:p>
     <w:p>
@@ -46142,7 +47120,7 @@
         <w:pStyle w:val="FirstParagraph"/>
       </w:pPr>
       <w:r>
-        <w:t xml:space="preserve">All reviews, newest first.</w:t>
+        <w:t xml:space="preserve">KHQR, ABA PayWay and cash: on or off (admin only).</w:t>
       </w:r>
     </w:p>
     <w:p>
@@ -46150,7 +47128,7 @@
         <w:pStyle w:val="BodyText"/>
       </w:pPr>
       <w:r>
-        <w:t xml:space="preserve">Parameters:</w:t>
+        <w:t xml:space="preserve">Response 200:</w:t>
       </w:r>
       <w:r>
         <w:t xml:space="preserve"> </w:t>
@@ -46159,13 +47137,13 @@
         <w:rPr>
           <w:rStyle w:val="VerbatimChar"/>
         </w:rPr>
-        <w:t xml:space="preserve">rating</w:t>
-      </w:r>
-      <w:r>
-        <w:t xml:space="preserve"> </w:t>
-      </w:r>
-      <w:r>
-        <w:t xml:space="preserve">(query) - Only this many stars,</w:t>
+        <w:t xml:space="preserve">data</w:t>
+      </w:r>
+      <w:r>
+        <w:t xml:space="preserve"> </w:t>
+      </w:r>
+      <w:r>
+        <w:t xml:space="preserve">= list of</w:t>
       </w:r>
       <w:r>
         <w:t xml:space="preserve"> </w:t>
@@ -46174,78 +47152,7 @@
         <w:rPr>
           <w:rStyle w:val="VerbatimChar"/>
         </w:rPr>
-        <w:t xml:space="preserve">q</w:t>
-      </w:r>
-      <w:r>
-        <w:t xml:space="preserve"> </w:t>
-      </w:r>
-      <w:r>
-        <w:t xml:space="preserve">(query) - Product or customer name,</w:t>
-      </w:r>
-      <w:r>
-        <w:t xml:space="preserve"> </w:t>
-      </w:r>
-      <w:r>
-        <w:rPr>
-          <w:rStyle w:val="VerbatimChar"/>
-        </w:rPr>
-        <w:t xml:space="preserve">page</w:t>
-      </w:r>
-      <w:r>
-        <w:t xml:space="preserve"> </w:t>
-      </w:r>
-      <w:r>
-        <w:t xml:space="preserve">(query) - Page number, from 1,</w:t>
-      </w:r>
-      <w:r>
-        <w:t xml:space="preserve"> </w:t>
-      </w:r>
-      <w:r>
-        <w:rPr>
-          <w:rStyle w:val="VerbatimChar"/>
-        </w:rPr>
-        <w:t xml:space="preserve">per_page</w:t>
-      </w:r>
-      <w:r>
-        <w:t xml:space="preserve"> </w:t>
-      </w:r>
-      <w:r>
-        <w:t xml:space="preserve">(query) - Rows per page (max 100 for admin lists, 50 for products).</w:t>
-      </w:r>
-    </w:p>
-    <w:p>
-      <w:pPr>
-        <w:pStyle w:val="BodyText"/>
-      </w:pPr>
-      <w:r>
-        <w:t xml:space="preserve">Response 200:</w:t>
-      </w:r>
-      <w:r>
-        <w:t xml:space="preserve"> </w:t>
-      </w:r>
-      <w:r>
-        <w:rPr>
-          <w:rStyle w:val="VerbatimChar"/>
-        </w:rPr>
-        <w:t xml:space="preserve">data</w:t>
-      </w:r>
-      <w:r>
-        <w:t xml:space="preserve"> </w:t>
-      </w:r>
-      <w:r>
-        <w:t xml:space="preserve">= {items: list of</w:t>
-      </w:r>
-      <w:r>
-        <w:t xml:space="preserve"> </w:t>
-      </w:r>
-      <w:r>
-        <w:rPr>
-          <w:rStyle w:val="VerbatimChar"/>
-        </w:rPr>
-        <w:t xml:space="preserve">AdminReview</w:t>
-      </w:r>
-      <w:r>
-        <w:t xml:space="preserve">, page: integer, per_page: integer, total: integer, total_pages: integer}</w:t>
+        <w:t xml:space="preserve">AdminPaymentMethod</w:t>
       </w:r>
     </w:p>
     <w:p>
@@ -46265,6 +47172,289 @@
         <w:rPr>
           <w:rStyle w:val="VerbatimChar"/>
         </w:rPr>
+        <w:t xml:space="preserve">PUT /api/admin/payment-methods/{method}</w:t>
+      </w:r>
+    </w:p>
+    <w:p>
+      <w:pPr>
+        <w:pStyle w:val="FirstParagraph"/>
+      </w:pPr>
+      <w:r>
+        <w:t xml:space="preserve">Turn a payment method on or off (admin only).</w:t>
+      </w:r>
+    </w:p>
+    <w:p>
+      <w:pPr>
+        <w:pStyle w:val="BodyText"/>
+      </w:pPr>
+      <w:r>
+        <w:t xml:space="preserve">Turned-off methods are hidden at checkout and refused by Place order; orders already placed with one can still be paid. 409 when it is the last method still on.</w:t>
+      </w:r>
+    </w:p>
+    <w:p>
+      <w:pPr>
+        <w:pStyle w:val="BodyText"/>
+      </w:pPr>
+      <w:r>
+        <w:t xml:space="preserve">Parameters:</w:t>
+      </w:r>
+      <w:r>
+        <w:t xml:space="preserve"> </w:t>
+      </w:r>
+      <w:r>
+        <w:rPr>
+          <w:rStyle w:val="VerbatimChar"/>
+        </w:rPr>
+        <w:t xml:space="preserve">method</w:t>
+      </w:r>
+      <w:r>
+        <w:t xml:space="preserve"> </w:t>
+      </w:r>
+      <w:r>
+        <w:t xml:space="preserve">(path, required).</w:t>
+      </w:r>
+    </w:p>
+    <w:p>
+      <w:pPr>
+        <w:pStyle w:val="BodyText"/>
+      </w:pPr>
+      <w:r>
+        <w:t xml:space="preserve">Body (application/json): {enabled: boolean}</w:t>
+      </w:r>
+    </w:p>
+    <w:p>
+      <w:pPr>
+        <w:pStyle w:val="SourceCode"/>
+      </w:pPr>
+      <w:r>
+        <w:rPr>
+          <w:rStyle w:val="FunctionTok"/>
+        </w:rPr>
+        <w:t xml:space="preserve">{</w:t>
+      </w:r>
+      <w:r>
+        <w:br/>
+      </w:r>
+      <w:r>
+        <w:rPr>
+          <w:rStyle w:val="NormalTok"/>
+        </w:rPr>
+        <w:t xml:space="preserve">  </w:t>
+      </w:r>
+      <w:r>
+        <w:rPr>
+          <w:rStyle w:val="DataTypeTok"/>
+        </w:rPr>
+        <w:t xml:space="preserve">"enabled"</w:t>
+      </w:r>
+      <w:r>
+        <w:rPr>
+          <w:rStyle w:val="FunctionTok"/>
+        </w:rPr>
+        <w:t xml:space="preserve">:</w:t>
+      </w:r>
+      <w:r>
+        <w:rPr>
+          <w:rStyle w:val="NormalTok"/>
+        </w:rPr>
+        <w:t xml:space="preserve"> </w:t>
+      </w:r>
+      <w:r>
+        <w:rPr>
+          <w:rStyle w:val="KeywordTok"/>
+        </w:rPr>
+        <w:t xml:space="preserve">false</w:t>
+      </w:r>
+      <w:r>
+        <w:br/>
+      </w:r>
+      <w:r>
+        <w:rPr>
+          <w:rStyle w:val="FunctionTok"/>
+        </w:rPr>
+        <w:t xml:space="preserve">}</w:t>
+      </w:r>
+    </w:p>
+    <w:p>
+      <w:pPr>
+        <w:pStyle w:val="FirstParagraph"/>
+      </w:pPr>
+      <w:r>
+        <w:t xml:space="preserve">Response 200:</w:t>
+      </w:r>
+      <w:r>
+        <w:t xml:space="preserve"> </w:t>
+      </w:r>
+      <w:r>
+        <w:rPr>
+          <w:rStyle w:val="VerbatimChar"/>
+        </w:rPr>
+        <w:t xml:space="preserve">data</w:t>
+      </w:r>
+      <w:r>
+        <w:t xml:space="preserve"> </w:t>
+      </w:r>
+      <w:r>
+        <w:t xml:space="preserve">= list of</w:t>
+      </w:r>
+      <w:r>
+        <w:t xml:space="preserve"> </w:t>
+      </w:r>
+      <w:r>
+        <w:rPr>
+          <w:rStyle w:val="VerbatimChar"/>
+        </w:rPr>
+        <w:t xml:space="preserve">AdminPaymentMethod</w:t>
+      </w:r>
+    </w:p>
+    <w:p>
+      <w:pPr>
+        <w:pStyle w:val="BodyText"/>
+      </w:pPr>
+      <w:r>
+        <w:t xml:space="preserve">Errors: 401, 403, 404, 409, 422</w:t>
+      </w:r>
+    </w:p>
+    <w:p>
+      <w:pPr>
+        <w:pStyle w:val="Heading4"/>
+        <w:keepNext/>
+      </w:pPr>
+      <w:r>
+        <w:rPr>
+          <w:rStyle w:val="VerbatimChar"/>
+        </w:rPr>
+        <w:t xml:space="preserve">GET /api/admin/reviews</w:t>
+      </w:r>
+    </w:p>
+    <w:p>
+      <w:pPr>
+        <w:pStyle w:val="FirstParagraph"/>
+      </w:pPr>
+      <w:r>
+        <w:t xml:space="preserve">All reviews, newest first.</w:t>
+      </w:r>
+    </w:p>
+    <w:p>
+      <w:pPr>
+        <w:pStyle w:val="BodyText"/>
+      </w:pPr>
+      <w:r>
+        <w:t xml:space="preserve">Parameters:</w:t>
+      </w:r>
+      <w:r>
+        <w:t xml:space="preserve"> </w:t>
+      </w:r>
+      <w:r>
+        <w:rPr>
+          <w:rStyle w:val="VerbatimChar"/>
+        </w:rPr>
+        <w:t xml:space="preserve">rating</w:t>
+      </w:r>
+      <w:r>
+        <w:t xml:space="preserve"> </w:t>
+      </w:r>
+      <w:r>
+        <w:t xml:space="preserve">(query) - Only this many stars,</w:t>
+      </w:r>
+      <w:r>
+        <w:t xml:space="preserve"> </w:t>
+      </w:r>
+      <w:r>
+        <w:rPr>
+          <w:rStyle w:val="VerbatimChar"/>
+        </w:rPr>
+        <w:t xml:space="preserve">q</w:t>
+      </w:r>
+      <w:r>
+        <w:t xml:space="preserve"> </w:t>
+      </w:r>
+      <w:r>
+        <w:t xml:space="preserve">(query) - Product or customer name,</w:t>
+      </w:r>
+      <w:r>
+        <w:t xml:space="preserve"> </w:t>
+      </w:r>
+      <w:r>
+        <w:rPr>
+          <w:rStyle w:val="VerbatimChar"/>
+        </w:rPr>
+        <w:t xml:space="preserve">page</w:t>
+      </w:r>
+      <w:r>
+        <w:t xml:space="preserve"> </w:t>
+      </w:r>
+      <w:r>
+        <w:t xml:space="preserve">(query) - Page number, from 1,</w:t>
+      </w:r>
+      <w:r>
+        <w:t xml:space="preserve"> </w:t>
+      </w:r>
+      <w:r>
+        <w:rPr>
+          <w:rStyle w:val="VerbatimChar"/>
+        </w:rPr>
+        <w:t xml:space="preserve">per_page</w:t>
+      </w:r>
+      <w:r>
+        <w:t xml:space="preserve"> </w:t>
+      </w:r>
+      <w:r>
+        <w:t xml:space="preserve">(query) - Rows per page (max 100 for admin lists, 50 for products).</w:t>
+      </w:r>
+    </w:p>
+    <w:p>
+      <w:pPr>
+        <w:pStyle w:val="BodyText"/>
+      </w:pPr>
+      <w:r>
+        <w:t xml:space="preserve">Response 200:</w:t>
+      </w:r>
+      <w:r>
+        <w:t xml:space="preserve"> </w:t>
+      </w:r>
+      <w:r>
+        <w:rPr>
+          <w:rStyle w:val="VerbatimChar"/>
+        </w:rPr>
+        <w:t xml:space="preserve">data</w:t>
+      </w:r>
+      <w:r>
+        <w:t xml:space="preserve"> </w:t>
+      </w:r>
+      <w:r>
+        <w:t xml:space="preserve">= {items: list of</w:t>
+      </w:r>
+      <w:r>
+        <w:t xml:space="preserve"> </w:t>
+      </w:r>
+      <w:r>
+        <w:rPr>
+          <w:rStyle w:val="VerbatimChar"/>
+        </w:rPr>
+        <w:t xml:space="preserve">AdminReview</w:t>
+      </w:r>
+      <w:r>
+        <w:t xml:space="preserve">, page: integer, per_page: integer, total: integer, total_pages: integer}</w:t>
+      </w:r>
+    </w:p>
+    <w:p>
+      <w:pPr>
+        <w:pStyle w:val="BodyText"/>
+      </w:pPr>
+      <w:r>
+        <w:t xml:space="preserve">Errors: 401, 403</w:t>
+      </w:r>
+    </w:p>
+    <w:p>
+      <w:pPr>
+        <w:pStyle w:val="Heading4"/>
+        <w:keepNext/>
+      </w:pPr>
+      <w:r>
+        <w:rPr>
+          <w:rStyle w:val="VerbatimChar"/>
+        </w:rPr>
         <w:t xml:space="preserve">DELETE /api/admin/reviews/{review_id}</w:t>
       </w:r>
     </w:p>
@@ -48003,7 +49193,7 @@
         <w:keepNext/>
       </w:pPr>
       <w:r>
-        <w:t xml:space="preserve">AdminReview</w:t>
+        <w:t xml:space="preserve">AdminPaymentMethod</w:t>
       </w:r>
     </w:p>
     <w:p>
@@ -48011,16 +49201,49 @@
         <w:pStyle w:val="FirstParagraph"/>
       </w:pPr>
       <w:r>
+        <w:t xml:space="preserve">{id:</w:t>
+      </w:r>
+      <w:r>
+        <w:t xml:space="preserve"> </w:t>
+      </w:r>
+      <w:r>
         <w:rPr>
           <w:rStyle w:val="VerbatimChar"/>
         </w:rPr>
-        <w:t xml:space="preserve">Review</w:t>
-      </w:r>
-      <w:r>
-        <w:t xml:space="preserve"> </w:t>
-      </w:r>
-      <w:r>
-        <w:t xml:space="preserve">+ {product: {id, name, image_url}, customer: {id, full_name, email}}</w:t>
+        <w:t xml:space="preserve">khqr</w:t>
+      </w:r>
+      <w:r>
+        <w:t xml:space="preserve"> </w:t>
+      </w:r>
+      <w:r>
+        <w:t xml:space="preserve">|</w:t>
+      </w:r>
+      <w:r>
+        <w:t xml:space="preserve"> </w:t>
+      </w:r>
+      <w:r>
+        <w:rPr>
+          <w:rStyle w:val="VerbatimChar"/>
+        </w:rPr>
+        <w:t xml:space="preserve">aba</w:t>
+      </w:r>
+      <w:r>
+        <w:t xml:space="preserve"> </w:t>
+      </w:r>
+      <w:r>
+        <w:t xml:space="preserve">|</w:t>
+      </w:r>
+      <w:r>
+        <w:t xml:space="preserve"> </w:t>
+      </w:r>
+      <w:r>
+        <w:rPr>
+          <w:rStyle w:val="VerbatimChar"/>
+        </w:rPr>
+        <w:t xml:space="preserve">cod</w:t>
+      </w:r>
+      <w:r>
+        <w:t xml:space="preserve">, label: string, enabled: boolean, set_up: boolean}</w:t>
       </w:r>
     </w:p>
     <w:p>
@@ -48029,7 +49252,7 @@
         <w:keepNext/>
       </w:pPr>
       <w:r>
-        <w:t xml:space="preserve">Stats</w:t>
+        <w:t xml:space="preserve">AdminReview</w:t>
       </w:r>
     </w:p>
     <w:p>
@@ -48037,7 +49260,16 @@
         <w:pStyle w:val="FirstParagraph"/>
       </w:pPr>
       <w:r>
-        <w:t xml:space="preserve">{week: list of {date, revenue}, week_revenue: number, products: integer, low_stock: integer, categories: integer, customers: integer, orders: integer, orders_to_handle: integer, refunds_to_send: integer, revenue: number, open_messages: integer}</w:t>
+        <w:rPr>
+          <w:rStyle w:val="VerbatimChar"/>
+        </w:rPr>
+        <w:t xml:space="preserve">Review</w:t>
+      </w:r>
+      <w:r>
+        <w:t xml:space="preserve"> </w:t>
+      </w:r>
+      <w:r>
+        <w:t xml:space="preserve">+ {product: {id, name, image_url}, customer: {id, full_name, email}}</w:t>
       </w:r>
     </w:p>
     <w:p>
@@ -48046,6 +49278,23 @@
         <w:keepNext/>
       </w:pPr>
       <w:r>
+        <w:t xml:space="preserve">Stats</w:t>
+      </w:r>
+    </w:p>
+    <w:p>
+      <w:pPr>
+        <w:pStyle w:val="FirstParagraph"/>
+      </w:pPr>
+      <w:r>
+        <w:t xml:space="preserve">{week: list of {date, revenue}, week_revenue: number, products: integer, low_stock: integer, categories: integer, customers: integer, orders: integer, orders_to_handle: integer, refunds_to_send: integer, revenue: number, open_messages: integer}</w:t>
+      </w:r>
+    </w:p>
+    <w:p>
+      <w:pPr>
+        <w:pStyle w:val="Heading3"/>
+        <w:keepNext/>
+      </w:pPr>
+      <w:r>
         <w:t xml:space="preserve">ActivityEvent</w:t>
       </w:r>
     </w:p>
@@ -48324,7 +49573,7 @@
         <w:rPr>
           <w:rStyle w:val="VerbatimChar"/>
         </w:rPr>
-        <w:t xml:space="preserve">flask --app run init-db             (creates the 16 tables, InnoDB with foreign keys)</w:t>
+        <w:t xml:space="preserve">flask --app run init-db             (creates the 17 tables, InnoDB with foreign keys)</w:t>
       </w:r>
       <w:r>
         <w:br/>
@@ -48528,7 +49777,7 @@
         <w:rPr>
           <w:rStyle w:val="VerbatimChar"/>
         </w:rPr>
-        <w:t xml:space="preserve">mobile/lib/core/constants/api_constants.dart</w:t>
+        <w:t xml:space="preserve">mobile/lib/api/api_domain.dart</w:t>
       </w:r>
       <w:r>
         <w:t xml:space="preserve"> </w:t>
@@ -48556,7 +49805,7 @@
       <w:r>
         <w:t xml:space="preserve"> </w:t>
       </w:r>
-      <w:hyperlink r:id="rId35">
+      <w:hyperlink r:id="rId44">
         <w:r>
           <w:rPr>
             <w:rStyle w:val="Hyperlink"/>
@@ -61918,6 +63167,294 @@
           <w:rStyle w:val="KeywordTok"/>
         </w:rPr>
         <w:t xml:space="preserve">DEFAULT</w:t>
+      </w:r>
+      <w:r>
+        <w:rPr>
+          <w:rStyle w:val="NormalTok"/>
+        </w:rPr>
+        <w:t xml:space="preserve"> </w:t>
+      </w:r>
+      <w:r>
+        <w:rPr>
+          <w:rStyle w:val="FunctionTok"/>
+        </w:rPr>
+        <w:t xml:space="preserve">CURRENT_TIMESTAMP</w:t>
+      </w:r>
+      <w:r>
+        <w:br/>
+      </w:r>
+      <w:r>
+        <w:rPr>
+          <w:rStyle w:val="NormalTok"/>
+        </w:rPr>
+        <w:t xml:space="preserve">) ENGINE</w:t>
+      </w:r>
+      <w:r>
+        <w:rPr>
+          <w:rStyle w:val="OperatorTok"/>
+        </w:rPr>
+        <w:t xml:space="preserve">=</w:t>
+      </w:r>
+      <w:r>
+        <w:rPr>
+          <w:rStyle w:val="NormalTok"/>
+        </w:rPr>
+        <w:t xml:space="preserve">InnoDB;</w:t>
+      </w:r>
+      <w:r>
+        <w:br/>
+      </w:r>
+      <w:r>
+        <w:br/>
+      </w:r>
+      <w:r>
+        <w:rPr>
+          <w:rStyle w:val="CommentTok"/>
+        </w:rPr>
+        <w:t xml:space="preserve">-- Ways to pay the owner can turn off (More &gt; Payment methods). Turned-off</w:t>
+      </w:r>
+      <w:r>
+        <w:br/>
+      </w:r>
+      <w:r>
+        <w:rPr>
+          <w:rStyle w:val="CommentTok"/>
+        </w:rPr>
+        <w:t xml:space="preserve">-- methods are hidden at checkout; a method with no row here is on.</w:t>
+      </w:r>
+      <w:r>
+        <w:br/>
+      </w:r>
+      <w:r>
+        <w:rPr>
+          <w:rStyle w:val="KeywordTok"/>
+        </w:rPr>
+        <w:t xml:space="preserve">CREATE</w:t>
+      </w:r>
+      <w:r>
+        <w:rPr>
+          <w:rStyle w:val="NormalTok"/>
+        </w:rPr>
+        <w:t xml:space="preserve"> </w:t>
+      </w:r>
+      <w:r>
+        <w:rPr>
+          <w:rStyle w:val="KeywordTok"/>
+        </w:rPr>
+        <w:t xml:space="preserve">TABLE</w:t>
+      </w:r>
+      <w:r>
+        <w:rPr>
+          <w:rStyle w:val="NormalTok"/>
+        </w:rPr>
+        <w:t xml:space="preserve"> payment_methods (</w:t>
+      </w:r>
+      <w:r>
+        <w:br/>
+      </w:r>
+      <w:r>
+        <w:rPr>
+          <w:rStyle w:val="NormalTok"/>
+        </w:rPr>
+        <w:t xml:space="preserve">  code          </w:t>
+      </w:r>
+      <w:r>
+        <w:rPr>
+          <w:rStyle w:val="DataTypeTok"/>
+        </w:rPr>
+        <w:t xml:space="preserve">VARCHAR</w:t>
+      </w:r>
+      <w:r>
+        <w:rPr>
+          <w:rStyle w:val="NormalTok"/>
+        </w:rPr>
+        <w:t xml:space="preserve">(</w:t>
+      </w:r>
+      <w:r>
+        <w:rPr>
+          <w:rStyle w:val="DecValTok"/>
+        </w:rPr>
+        <w:t xml:space="preserve">10</w:t>
+      </w:r>
+      <w:r>
+        <w:rPr>
+          <w:rStyle w:val="NormalTok"/>
+        </w:rPr>
+        <w:t xml:space="preserve">)   </w:t>
+      </w:r>
+      <w:r>
+        <w:rPr>
+          <w:rStyle w:val="KeywordTok"/>
+        </w:rPr>
+        <w:t xml:space="preserve">PRIMARY</w:t>
+      </w:r>
+      <w:r>
+        <w:rPr>
+          <w:rStyle w:val="NormalTok"/>
+        </w:rPr>
+        <w:t xml:space="preserve"> </w:t>
+      </w:r>
+      <w:r>
+        <w:rPr>
+          <w:rStyle w:val="KeywordTok"/>
+        </w:rPr>
+        <w:t xml:space="preserve">KEY</w:t>
+      </w:r>
+      <w:r>
+        <w:rPr>
+          <w:rStyle w:val="NormalTok"/>
+        </w:rPr>
+        <w:t xml:space="preserve">,              </w:t>
+      </w:r>
+      <w:r>
+        <w:rPr>
+          <w:rStyle w:val="CommentTok"/>
+        </w:rPr>
+        <w:t xml:space="preserve">-- khqr, aba or cod</w:t>
+      </w:r>
+      <w:r>
+        <w:br/>
+      </w:r>
+      <w:r>
+        <w:rPr>
+          <w:rStyle w:val="NormalTok"/>
+        </w:rPr>
+        <w:t xml:space="preserve">  is_enabled    </w:t>
+      </w:r>
+      <w:r>
+        <w:rPr>
+          <w:rStyle w:val="DataTypeTok"/>
+        </w:rPr>
+        <w:t xml:space="preserve">BOOLEAN</w:t>
+      </w:r>
+      <w:r>
+        <w:rPr>
+          <w:rStyle w:val="NormalTok"/>
+        </w:rPr>
+        <w:t xml:space="preserve">       </w:t>
+      </w:r>
+      <w:r>
+        <w:rPr>
+          <w:rStyle w:val="KeywordTok"/>
+        </w:rPr>
+        <w:t xml:space="preserve">NOT</w:t>
+      </w:r>
+      <w:r>
+        <w:rPr>
+          <w:rStyle w:val="NormalTok"/>
+        </w:rPr>
+        <w:t xml:space="preserve"> </w:t>
+      </w:r>
+      <w:r>
+        <w:rPr>
+          <w:rStyle w:val="KeywordTok"/>
+        </w:rPr>
+        <w:t xml:space="preserve">NULL</w:t>
+      </w:r>
+      <w:r>
+        <w:rPr>
+          <w:rStyle w:val="NormalTok"/>
+        </w:rPr>
+        <w:t xml:space="preserve"> </w:t>
+      </w:r>
+      <w:r>
+        <w:rPr>
+          <w:rStyle w:val="KeywordTok"/>
+        </w:rPr>
+        <w:t xml:space="preserve">DEFAULT</w:t>
+      </w:r>
+      <w:r>
+        <w:rPr>
+          <w:rStyle w:val="NormalTok"/>
+        </w:rPr>
+        <w:t xml:space="preserve"> </w:t>
+      </w:r>
+      <w:r>
+        <w:rPr>
+          <w:rStyle w:val="KeywordTok"/>
+        </w:rPr>
+        <w:t xml:space="preserve">TRUE</w:t>
+      </w:r>
+      <w:r>
+        <w:rPr>
+          <w:rStyle w:val="NormalTok"/>
+        </w:rPr>
+        <w:t xml:space="preserve">,</w:t>
+      </w:r>
+      <w:r>
+        <w:br/>
+      </w:r>
+      <w:r>
+        <w:rPr>
+          <w:rStyle w:val="NormalTok"/>
+        </w:rPr>
+        <w:t xml:space="preserve">  updated_at    DATETIME      </w:t>
+      </w:r>
+      <w:r>
+        <w:rPr>
+          <w:rStyle w:val="KeywordTok"/>
+        </w:rPr>
+        <w:t xml:space="preserve">NOT</w:t>
+      </w:r>
+      <w:r>
+        <w:rPr>
+          <w:rStyle w:val="NormalTok"/>
+        </w:rPr>
+        <w:t xml:space="preserve"> </w:t>
+      </w:r>
+      <w:r>
+        <w:rPr>
+          <w:rStyle w:val="KeywordTok"/>
+        </w:rPr>
+        <w:t xml:space="preserve">NULL</w:t>
+      </w:r>
+      <w:r>
+        <w:rPr>
+          <w:rStyle w:val="NormalTok"/>
+        </w:rPr>
+        <w:t xml:space="preserve"> </w:t>
+      </w:r>
+      <w:r>
+        <w:rPr>
+          <w:rStyle w:val="KeywordTok"/>
+        </w:rPr>
+        <w:t xml:space="preserve">DEFAULT</w:t>
+      </w:r>
+      <w:r>
+        <w:rPr>
+          <w:rStyle w:val="NormalTok"/>
+        </w:rPr>
+        <w:t xml:space="preserve"> </w:t>
+      </w:r>
+      <w:r>
+        <w:rPr>
+          <w:rStyle w:val="FunctionTok"/>
+        </w:rPr>
+        <w:t xml:space="preserve">CURRENT_TIMESTAMP</w:t>
+      </w:r>
+      <w:r>
+        <w:rPr>
+          <w:rStyle w:val="NormalTok"/>
+        </w:rPr>
+        <w:t xml:space="preserve"> </w:t>
+      </w:r>
+      <w:r>
+        <w:rPr>
+          <w:rStyle w:val="KeywordTok"/>
+        </w:rPr>
+        <w:t xml:space="preserve">ON</w:t>
+      </w:r>
+      <w:r>
+        <w:rPr>
+          <w:rStyle w:val="NormalTok"/>
+        </w:rPr>
+        <w:t xml:space="preserve"> </w:t>
+      </w:r>
+      <w:r>
+        <w:rPr>
+          <w:rStyle w:val="KeywordTok"/>
+        </w:rPr>
+        <w:t xml:space="preserve">UPDATE</w:t>
       </w:r>
       <w:r>
         <w:rPr>

</xml_diff>

<commit_message>
fix(orders): clear store pickup flow; shop finishes pickup and cash orders
"Got it" let a customer mark a cash order as paid without paying. It is now
only for paid online deliveries; the server answers 409 for pickup and cash
orders, and the app hides the button. Staff finish those orders.

Pickup orders now say Ready and Picked up everywhere: staff buttons in the web
admin, app admin and /admin panel, status chips, the activity feed, order
status lines and notifications. The database statuses stay shipped/delivered.
Claude-Session: https://claude.ai/code/session_01L2MK4BVb8vmpPBvTsaVt4h
</commit_message>
<xml_diff>
--- a/docs/PROJECT_DOCUMENTATION.docx
+++ b/docs/PROJECT_DOCUMENTATION.docx
@@ -117,7 +117,7 @@
         <w:t xml:space="preserve"> </w:t>
       </w:r>
       <w:r>
-        <w:t xml:space="preserve">27 October 2026</w:t>
+        <w:t xml:space="preserve">30 October 2026</w:t>
       </w:r>
       <w:r>
         <w:br/>
@@ -6347,13 +6347,19 @@
                 <w:bCs/>
                 <w:sz w:val="19"/>
               </w:rPr>
-              <w:t xml:space="preserve">confirm an order was received</w:t>
-            </w:r>
-            <w:r>
-              <w:rPr>
-                <w:sz w:val="19"/>
-              </w:rPr>
-              <w:t xml:space="preserve">,</w:t>
+              <w:t xml:space="preserve">confirm a paid delivery was received</w:t>
+            </w:r>
+            <w:r>
+              <w:rPr>
+                <w:sz w:val="19"/>
+              </w:rPr>
+              <w:t xml:space="preserve"> </w:t>
+            </w:r>
+            <w:r>
+              <w:rPr>
+                <w:sz w:val="19"/>
+              </w:rPr>
+              <w:t xml:space="preserve">(the shop finishes store pickup and cash orders),</w:t>
             </w:r>
             <w:r>
               <w:rPr>
@@ -25433,7 +25439,7 @@
         <w:t xml:space="preserve"> </w:t>
       </w:r>
       <w:r>
-        <w:t xml:space="preserve">4. Optional (UC-17): when the order is on the way the customer taps</w:t>
+        <w:t xml:space="preserve">4. Optional (UC-17): when a paid KHQR or ABA PayWay order is on the way the customer taps</w:t>
       </w:r>
       <w:r>
         <w:t xml:space="preserve"> </w:t>
@@ -25445,7 +25451,7 @@
         <w:t xml:space="preserve"> </w:t>
       </w:r>
       <w:r>
-        <w:t xml:space="preserve">to confirm it was received; for a finished order they can tap</w:t>
+        <w:t xml:space="preserve">to confirm it was received (the shop finishes store pickup and cash orders, because it hands them over or takes the money); for a finished order they can tap</w:t>
       </w:r>
       <w:r>
         <w:t xml:space="preserve"> </w:t>
@@ -37968,7 +37974,7 @@
         <w:pStyle w:val="BodyText"/>
       </w:pPr>
       <w:r>
-        <w:t xml:space="preserve">Only for shipped orders. Cash orders count as paid.</w:t>
+        <w:t xml:space="preserve">Only for a paid online order being delivered. 409 for store pickup and cash orders: the shop finishes those.</w:t>
       </w:r>
     </w:p>
     <w:p>

</xml_diff>